<commit_message>
Update Jonatas ABCD reflections to cite Cursor usage at RD Saúde.
Co-authored-by: Jonatas Andrade <jonatasandradedeveloper@users.noreply.github.com>
</commit_message>
<xml_diff>
--- a/DOCS-PEOPLE-LEAD/Jonatas/01-ABCD-Reflexoes-Prontas.docx
+++ b/DOCS-PEOPLE-LEAD/Jonatas/01-ABCD-Reflexoes-Prontas.docx
@@ -14,7 +14,7 @@
           <w:color w:val="1F3A5F"/>
           <w:sz w:val="24"/>
         </w:rPr>
-        <w:t>ABCD REFLECTIONS · TEXTOS PARA COLAR · PRAZO 28/08</w:t>
+        <w:t>ABCD REFLECTIONS · CURSOR NA RD · PRAZO 28/08</w:t>
       </w:r>
     </w:p>
     <w:p>
@@ -30,21 +30,6 @@
           <w:sz w:val="40"/>
         </w:rPr>
         <w:t>Jonatas Andrade Da Silva</w:t>
-      </w:r>
-    </w:p>
-    <w:p>
-      <w:pPr>
-        <w:jc w:val="center"/>
-      </w:pPr>
-      <w:r>
-        <w:rPr>
-          <w:rFonts w:ascii="Calibri" w:hAnsi="Calibri" w:eastAsia="Calibri"/>
-          <w:b w:val="0"/>
-          <w:i/>
-          <w:color w:val="555555"/>
-          <w:sz w:val="22"/>
-        </w:rPr>
-        <w:t>Consultant, Mobile · RAIA DROGASIL / RD Saúde</w:t>
       </w:r>
     </w:p>
     <w:p/>
@@ -95,6 +80,37 @@
       <w:r>
         <w:rPr>
           <w:rFonts w:ascii="Calibri" w:hAnsi="Calibri" w:eastAsia="Calibri"/>
+          <w:b/>
+          <w:i w:val="0"/>
+          <w:sz w:val="22"/>
+        </w:rPr>
+        <w:t>Ferramenta de IA no cliente RD: Cursor</w:t>
+      </w:r>
+      <w:r>
+        <w:rPr>
+          <w:rFonts w:ascii="Calibri" w:hAnsi="Calibri" w:eastAsia="Calibri"/>
+          <w:b w:val="0"/>
+          <w:i w:val="0"/>
+          <w:sz w:val="22"/>
+        </w:rPr>
+        <w:t xml:space="preserve"> (uso no dia a dia).</w:t>
+      </w:r>
+    </w:p>
+    <w:p>
+      <w:r>
+        <w:rPr>
+          <w:rFonts w:ascii="Calibri" w:hAnsi="Calibri" w:eastAsia="Calibri"/>
+          <w:b w:val="0"/>
+          <w:i w:val="0"/>
+          <w:sz w:val="22"/>
+        </w:rPr>
+        <w:t>Certificações Microsoft AI-900 / Copilot: manter na prioridade de capacitação conforme status real.</w:t>
+      </w:r>
+    </w:p>
+    <w:p>
+      <w:r>
+        <w:rPr>
+          <w:rFonts w:ascii="Calibri" w:hAnsi="Calibri" w:eastAsia="Calibri"/>
           <w:b w:val="0"/>
           <w:i w:val="0"/>
           <w:sz w:val="22"/>
@@ -135,7 +151,7 @@
           <w:i w:val="0"/>
           <w:sz w:val="22"/>
         </w:rPr>
-        <w:t xml:space="preserve"> → precisa </w:t>
+        <w:t xml:space="preserve"> → </w:t>
       </w:r>
       <w:r>
         <w:rPr>
@@ -182,7 +198,7 @@
           <w:i w:val="0"/>
           <w:sz w:val="22"/>
         </w:rPr>
-        <w:t xml:space="preserve">Revisores já cadastrados: </w:t>
+        <w:t xml:space="preserve">Revisores: </w:t>
       </w:r>
       <w:r>
         <w:rPr>
@@ -262,7 +278,7 @@
           <w:i w:val="0"/>
           <w:sz w:val="22"/>
         </w:rPr>
-        <w:t>Evidências usadas nestes textos:</w:t>
+        <w:t>Evidências:</w:t>
       </w:r>
     </w:p>
     <w:p>
@@ -276,7 +292,7 @@
           <w:i w:val="0"/>
           <w:sz w:val="22"/>
         </w:rPr>
-        <w:t>Feedback Anderson Sant’Anna (Senior Dev, RD) — ~2 anos juntos</w:t>
+        <w:t>Feedback Anderson Sant’Anna (Senior Dev, RD)</w:t>
       </w:r>
     </w:p>
     <w:p>
@@ -305,312 +321,6 @@
           <w:sz w:val="22"/>
         </w:rPr>
         <w:t>Feedback João Victor (Test Analyst, Develcode) — 30/06/2026</w:t>
-      </w:r>
-    </w:p>
-    <w:p>
-      <w:pPr>
-        <w:ind w:left="425"/>
-      </w:pPr>
-      <w:r>
-        <w:rPr>
-          <w:rFonts w:ascii="Calibri" w:hAnsi="Calibri" w:eastAsia="Calibri"/>
-          <w:b w:val="0"/>
-          <w:i/>
-          <w:color w:val="555555"/>
-          <w:sz w:val="22"/>
-        </w:rPr>
-        <w:t>Ajuste nomes de features, % e status de certificação se algo não bater 100% com o que você fez.</w:t>
-      </w:r>
-    </w:p>
-    <w:p>
-      <w:pPr>
-        <w:pBdr>
-          <w:bottom w:val="single" w:sz="6" w:space="1" w:color="CCCCCC"/>
-        </w:pBdr>
-      </w:pPr>
-    </w:p>
-    <w:p>
-      <w:pPr>
-        <w:pStyle w:val="Heading2"/>
-      </w:pPr>
-      <w:r>
-        <w:t>Como preencher no Workday (rápido)</w:t>
-      </w:r>
-    </w:p>
-    <w:p>
-      <w:pPr>
-        <w:pStyle w:val="ListNumber"/>
-      </w:pPr>
-      <w:r>
-        <w:rPr>
-          <w:rFonts w:ascii="Calibri" w:hAnsi="Calibri" w:eastAsia="Calibri"/>
-          <w:b w:val="0"/>
-          <w:i w:val="0"/>
-          <w:sz w:val="22"/>
-        </w:rPr>
-        <w:t xml:space="preserve">Performance → </w:t>
-      </w:r>
-      <w:r>
-        <w:rPr>
-          <w:rFonts w:ascii="Calibri" w:hAnsi="Calibri" w:eastAsia="Calibri"/>
-          <w:b/>
-          <w:i w:val="0"/>
-          <w:sz w:val="22"/>
-        </w:rPr>
-        <w:t>ABCD Reflections</w:t>
-      </w:r>
-      <w:r>
-        <w:rPr>
-          <w:rFonts w:ascii="Calibri" w:hAnsi="Calibri" w:eastAsia="Calibri"/>
-          <w:b w:val="0"/>
-          <w:i w:val="0"/>
-          <w:sz w:val="22"/>
-        </w:rPr>
-        <w:t xml:space="preserve"> (ou Priorities → </w:t>
-      </w:r>
-      <w:r>
-        <w:rPr>
-          <w:rFonts w:ascii="Calibri" w:hAnsi="Calibri" w:eastAsia="Calibri"/>
-          <w:b/>
-          <w:i w:val="0"/>
-          <w:sz w:val="22"/>
-        </w:rPr>
-        <w:t>Start Reflection</w:t>
-      </w:r>
-      <w:r>
-        <w:rPr>
-          <w:rFonts w:ascii="Calibri" w:hAnsi="Calibri" w:eastAsia="Calibri"/>
-          <w:b w:val="0"/>
-          <w:i w:val="0"/>
-          <w:sz w:val="22"/>
-        </w:rPr>
-        <w:t xml:space="preserve"> / Salvar e Refletir).</w:t>
-      </w:r>
-    </w:p>
-    <w:p>
-      <w:pPr>
-        <w:pStyle w:val="ListNumber"/>
-      </w:pPr>
-      <w:r>
-        <w:rPr>
-          <w:rFonts w:ascii="Calibri" w:hAnsi="Calibri" w:eastAsia="Calibri"/>
-          <w:b w:val="0"/>
-          <w:i w:val="0"/>
-          <w:sz w:val="22"/>
-        </w:rPr>
-        <w:t xml:space="preserve">Para </w:t>
-      </w:r>
-      <w:r>
-        <w:rPr>
-          <w:rFonts w:ascii="Calibri" w:hAnsi="Calibri" w:eastAsia="Calibri"/>
-          <w:b/>
-          <w:i w:val="0"/>
-          <w:sz w:val="22"/>
-        </w:rPr>
-        <w:t>cada</w:t>
-      </w:r>
-      <w:r>
-        <w:rPr>
-          <w:rFonts w:ascii="Calibri" w:hAnsi="Calibri" w:eastAsia="Calibri"/>
-          <w:b w:val="0"/>
-          <w:i w:val="0"/>
-          <w:sz w:val="22"/>
-        </w:rPr>
-        <w:t xml:space="preserve"> das 4 prioridades:</w:t>
-      </w:r>
-    </w:p>
-    <w:p>
-      <w:pPr>
-        <w:pStyle w:val="ListBullet"/>
-      </w:pPr>
-      <w:r>
-        <w:rPr>
-          <w:rFonts w:ascii="Calibri" w:hAnsi="Calibri" w:eastAsia="Calibri"/>
-          <w:b w:val="0"/>
-          <w:i w:val="0"/>
-          <w:sz w:val="22"/>
-        </w:rPr>
-        <w:t xml:space="preserve">Colar </w:t>
-      </w:r>
-      <w:r>
-        <w:rPr>
-          <w:rFonts w:ascii="Calibri" w:hAnsi="Calibri" w:eastAsia="Calibri"/>
-          <w:b/>
-          <w:i w:val="0"/>
-          <w:sz w:val="22"/>
-        </w:rPr>
-        <w:t>Self Reflection Comments</w:t>
-      </w:r>
-    </w:p>
-    <w:p>
-      <w:pPr>
-        <w:pStyle w:val="ListBullet"/>
-      </w:pPr>
-      <w:r>
-        <w:rPr>
-          <w:rFonts w:ascii="Calibri" w:hAnsi="Calibri" w:eastAsia="Calibri"/>
-          <w:b w:val="0"/>
-          <w:i w:val="0"/>
-          <w:sz w:val="22"/>
-        </w:rPr>
-        <w:t xml:space="preserve">Escolher </w:t>
-      </w:r>
-      <w:r>
-        <w:rPr>
-          <w:rFonts w:ascii="Calibri" w:hAnsi="Calibri" w:eastAsia="Calibri"/>
-          <w:b/>
-          <w:i w:val="0"/>
-          <w:sz w:val="22"/>
-        </w:rPr>
-        <w:t>Level of Impact</w:t>
-      </w:r>
-      <w:r>
-        <w:rPr>
-          <w:rFonts w:ascii="Calibri" w:hAnsi="Calibri" w:eastAsia="Calibri"/>
-          <w:b w:val="0"/>
-          <w:i w:val="0"/>
-          <w:sz w:val="22"/>
-        </w:rPr>
-        <w:t xml:space="preserve"> (slider)</w:t>
-      </w:r>
-    </w:p>
-    <w:p>
-      <w:pPr>
-        <w:pStyle w:val="ListBullet"/>
-      </w:pPr>
-      <w:r>
-        <w:rPr>
-          <w:rFonts w:ascii="Calibri" w:hAnsi="Calibri" w:eastAsia="Calibri"/>
-          <w:b w:val="0"/>
-          <w:i w:val="0"/>
-          <w:sz w:val="22"/>
-        </w:rPr>
-        <w:t xml:space="preserve">Marcar </w:t>
-      </w:r>
-      <w:r>
-        <w:rPr>
-          <w:rFonts w:ascii="Calibri" w:hAnsi="Calibri" w:eastAsia="Calibri"/>
-          <w:b/>
-          <w:i w:val="0"/>
-          <w:sz w:val="22"/>
-        </w:rPr>
-        <w:t>Self On Track</w:t>
-      </w:r>
-      <w:r>
-        <w:rPr>
-          <w:rFonts w:ascii="Calibri" w:hAnsi="Calibri" w:eastAsia="Calibri"/>
-          <w:b w:val="0"/>
-          <w:i w:val="0"/>
-          <w:sz w:val="22"/>
-        </w:rPr>
-        <w:t xml:space="preserve"> (Yes, se for o caso)</w:t>
-      </w:r>
-    </w:p>
-    <w:p>
-      <w:pPr>
-        <w:pStyle w:val="ListBullet"/>
-      </w:pPr>
-      <w:r>
-        <w:rPr>
-          <w:rFonts w:ascii="Calibri" w:hAnsi="Calibri" w:eastAsia="Calibri"/>
-          <w:b w:val="0"/>
-          <w:i w:val="0"/>
-          <w:sz w:val="22"/>
-        </w:rPr>
-        <w:t xml:space="preserve">Preencher </w:t>
-      </w:r>
-      <w:r>
-        <w:rPr>
-          <w:rFonts w:ascii="Calibri" w:hAnsi="Calibri" w:eastAsia="Calibri"/>
-          <w:b/>
-          <w:i w:val="0"/>
-          <w:sz w:val="22"/>
-        </w:rPr>
-        <w:t>Actuals</w:t>
-      </w:r>
-      <w:r>
-        <w:rPr>
-          <w:rFonts w:ascii="Calibri" w:hAnsi="Calibri" w:eastAsia="Calibri"/>
-          <w:b w:val="0"/>
-          <w:i w:val="0"/>
-          <w:sz w:val="22"/>
-        </w:rPr>
-        <w:t xml:space="preserve"> das métricas</w:t>
-      </w:r>
-    </w:p>
-    <w:p>
-      <w:pPr>
-        <w:pStyle w:val="ListNumber"/>
-      </w:pPr>
-      <w:r>
-        <w:rPr>
-          <w:rFonts w:ascii="Calibri" w:hAnsi="Calibri" w:eastAsia="Calibri"/>
-          <w:b/>
-          <w:i w:val="0"/>
-          <w:sz w:val="22"/>
-        </w:rPr>
-        <w:t>Submit / Enviar</w:t>
-      </w:r>
-      <w:r>
-        <w:rPr>
-          <w:rFonts w:ascii="Calibri" w:hAnsi="Calibri" w:eastAsia="Calibri"/>
-          <w:b w:val="0"/>
-          <w:i w:val="0"/>
-          <w:sz w:val="22"/>
-        </w:rPr>
-        <w:t xml:space="preserve"> (não deixar rascunho).</w:t>
-      </w:r>
-    </w:p>
-    <w:p>
-      <w:pPr>
-        <w:pStyle w:val="ListNumber"/>
-      </w:pPr>
-      <w:r>
-        <w:rPr>
-          <w:rFonts w:ascii="Calibri" w:hAnsi="Calibri" w:eastAsia="Calibri"/>
-          <w:b w:val="0"/>
-          <w:i w:val="0"/>
-          <w:sz w:val="22"/>
-        </w:rPr>
-        <w:t>Se o fluxo pedir, solicitar reflexão dos PRs (</w:t>
-      </w:r>
-      <w:r>
-        <w:rPr>
-          <w:rFonts w:ascii="Consolas" w:hAnsi="Consolas" w:eastAsia="Consolas"/>
-          <w:b w:val="0"/>
-          <w:i w:val="0"/>
-          <w:color w:val="333333"/>
-          <w:sz w:val="18"/>
-        </w:rPr>
-        <w:t>thais.c.de.oliveira</w:t>
-      </w:r>
-      <w:r>
-        <w:rPr>
-          <w:rFonts w:ascii="Calibri" w:hAnsi="Calibri" w:eastAsia="Calibri"/>
-          <w:b w:val="0"/>
-          <w:i w:val="0"/>
-          <w:sz w:val="22"/>
-        </w:rPr>
-        <w:t xml:space="preserve"> / </w:t>
-      </w:r>
-      <w:r>
-        <w:rPr>
-          <w:rFonts w:ascii="Consolas" w:hAnsi="Consolas" w:eastAsia="Consolas"/>
-          <w:b w:val="0"/>
-          <w:i w:val="0"/>
-          <w:color w:val="333333"/>
-          <w:sz w:val="18"/>
-        </w:rPr>
-        <w:t>e.melo.pereira.souza</w:t>
-      </w:r>
-      <w:r>
-        <w:rPr>
-          <w:rFonts w:ascii="Calibri" w:hAnsi="Calibri" w:eastAsia="Calibri"/>
-          <w:b w:val="0"/>
-          <w:i w:val="0"/>
-          <w:sz w:val="22"/>
-        </w:rPr>
-        <w:t>).</w:t>
       </w:r>
     </w:p>
     <w:p>
@@ -645,10 +355,8 @@
           <w:i w:val="0"/>
           <w:sz w:val="22"/>
         </w:rPr>
-        <w:t xml:space="preserve"> Client Value Creation</w:t>
+        <w:t xml:space="preserve"> Client Value Creation · </w:t>
       </w:r>
-    </w:p>
-    <w:p>
       <w:r>
         <w:rPr>
           <w:rFonts w:ascii="Calibri" w:hAnsi="Calibri" w:eastAsia="Calibri"/>
@@ -676,16 +384,7 @@
           <w:i w:val="0"/>
           <w:sz w:val="22"/>
         </w:rPr>
-        <w:t>Status da prioridade:</w:t>
-      </w:r>
-      <w:r>
-        <w:rPr>
-          <w:rFonts w:ascii="Calibri" w:hAnsi="Calibri" w:eastAsia="Calibri"/>
-          <w:b w:val="0"/>
-          <w:i w:val="0"/>
-          <w:sz w:val="22"/>
-        </w:rPr>
-        <w:t xml:space="preserve"> In Progress</w:t>
+        <w:t>Impacto: 8–9 · On Track: Yes</w:t>
       </w:r>
     </w:p>
     <w:p>
@@ -704,7 +403,25 @@
           <w:i w:val="0"/>
           <w:sz w:val="22"/>
         </w:rPr>
-        <w:t>Durante o FY26, apliquei conhecimentos de Inteligência Artificial e ferramentas como Microsoft Copilot no desenvolvimento mobile na RD Saúde, com foco em qualidade técnica, eficiência e velocidade das entregas.</w:t>
+        <w:t xml:space="preserve">Durante o FY26, apliquei conhecimentos de Inteligência Artificial no desenvolvimento mobile na RD Saúde, utilizando o </w:t>
+      </w:r>
+      <w:r>
+        <w:rPr>
+          <w:rFonts w:ascii="Calibri" w:hAnsi="Calibri" w:eastAsia="Calibri"/>
+          <w:b/>
+          <w:i w:val="0"/>
+          <w:sz w:val="22"/>
+        </w:rPr>
+        <w:t>Cursor</w:t>
+      </w:r>
+      <w:r>
+        <w:rPr>
+          <w:rFonts w:ascii="Calibri" w:hAnsi="Calibri" w:eastAsia="Calibri"/>
+          <w:b w:val="0"/>
+          <w:i w:val="0"/>
+          <w:sz w:val="22"/>
+        </w:rPr>
+        <w:t xml:space="preserve"> como ferramenta principal de IA no dia a dia, com foco em qualidade técnica, eficiência e velocidade das entregas, gerando valor direto para o cliente.</w:t>
       </w:r>
     </w:p>
     <w:p>
@@ -715,7 +432,7 @@
           <w:i w:val="0"/>
           <w:sz w:val="22"/>
         </w:rPr>
-        <w:t>O que deu certo: o uso recorrente de IA no fluxo de desenvolvimento ajudou a acelerar implementação, reduzir retrabalho e elevar a qualidade do código entregue ao cliente. Os feedbacks do período reforçam essa contribuição: Anderson Sant’Anna destacou qualidade técnica, preocupação com impactos futuros das implementações e decisões mais sustentáveis; Sergio Deiró avaliou a performance como excelente, com senso de dono, proatividade e qualidade em demandas complexas, além de código limpo e sustentável; João Victor apontou colaboração efetiva entre Dev e QA, facilitando o fluxo das entregas. Esses pontos mostram que a aplicação de IA não ficou só em experimento — gerou valor direto no dia a dia do projeto e na confiança do time e do cliente.</w:t>
+        <w:t>O que deu certo: o uso recorrente do Cursor no fluxo de desenvolvimento ajudou a acelerar implementação, reduzir retrabalho e elevar a qualidade do código entregue. A IA foi aplicada de forma prática — compreensão de código, implementação, refino e apoio a demandas complexas — alinhada às necessidades do negócio. Os feedbacks do período reforçam o resultado: Anderson Sant’Anna destacou qualidade técnica, preocupação com impactos futuros das implementações e decisões mais sustentáveis; Sergio Deiró avaliou a performance como excelente, com senso de dono, proatividade, qualidade em demandas complexas e código limpo/sustentável; João Victor apontou colaboração efetiva entre Dev e QA, facilitando o fluxo das entregas. Isso mostra que a aplicação de IA via Cursor gerou valor concreto no projeto RD, não apenas experimento.</w:t>
       </w:r>
     </w:p>
     <w:p>
@@ -726,7 +443,7 @@
           <w:i w:val="0"/>
           <w:sz w:val="22"/>
         </w:rPr>
-        <w:t>O que poderia ser melhor / diferente: aprofundar ainda mais a visão holística da arquitetura da plataforma RD e usar IA de forma ainda mais estruturada para acelerar entendimento de sistemas complexos, além de registrar com mais frequência os ganhos concretos (tempo, qualidade, redução de retrabalho) para tornar o impacto ainda mais mensurável.</w:t>
+        <w:t>O que poderia ser melhor: aprofundar a visão holística da arquitetura da plataforma RD e usar o Cursor de forma ainda mais estruturada para acelerar o entendimento de sistemas complexos; registrar com mais frequência ganhos concretos (tempo, qualidade, redução de retrabalho) para tornar o impacto ainda mais mensurável.</w:t>
       </w:r>
     </w:p>
     <w:p>
@@ -737,7 +454,7 @@
           <w:i w:val="0"/>
           <w:sz w:val="22"/>
         </w:rPr>
-        <w:t>Próximos passos: manter Copilot/IA no fluxo diário; documentar 2–3 casos de ganho de produtividade/qualidade; ampliar contribuição em discussões de arquitetura e evolução da plataforma, alinhado ao feedback do Tech Lead e do time.</w:t>
+        <w:t>Próximos passos: manter o Cursor no fluxo diário; documentar 2–3 casos de ganho de produtividade/qualidade; ampliar contribuição em discussões de arquitetura e evolução da plataforma, alinhado ao feedback do Tech Lead e do time.</w:t>
       </w:r>
     </w:p>
     <w:p>
@@ -745,707 +462,7 @@
         <w:pStyle w:val="Heading3"/>
       </w:pPr>
       <w:r>
-        <w:t>Self Reflection — Level of Impact</w:t>
-      </w:r>
-    </w:p>
-    <w:p>
-      <w:r>
-        <w:rPr>
-          <w:rFonts w:ascii="Calibri" w:hAnsi="Calibri" w:eastAsia="Calibri"/>
-          <w:b/>
-          <w:i w:val="0"/>
-          <w:sz w:val="22"/>
-        </w:rPr>
-        <w:t>8–9 (High)</w:t>
-      </w:r>
-    </w:p>
-    <w:p>
-      <w:r>
-        <w:rPr>
-          <w:rFonts w:ascii="Calibri" w:hAnsi="Calibri" w:eastAsia="Calibri"/>
-          <w:b w:val="0"/>
-          <w:i w:val="0"/>
-          <w:sz w:val="22"/>
-        </w:rPr>
-        <w:t>Justificativa interna: entregas com qualidade reconhecida por Tech Lead, Senior Dev e QA; impacto contínuo no cliente RD.</w:t>
-      </w:r>
-    </w:p>
-    <w:p>
-      <w:pPr>
-        <w:pStyle w:val="Heading3"/>
-      </w:pPr>
-      <w:r>
-        <w:t>Self On Track</w:t>
-      </w:r>
-    </w:p>
-    <w:p>
-      <w:r>
-        <w:rPr>
-          <w:rFonts w:ascii="Calibri" w:hAnsi="Calibri" w:eastAsia="Calibri"/>
-          <w:b/>
-          <w:i w:val="0"/>
-          <w:sz w:val="22"/>
-        </w:rPr>
-        <w:t>Yes / On Track</w:t>
-      </w:r>
-    </w:p>
-    <w:p>
-      <w:pPr>
-        <w:pStyle w:val="Heading3"/>
-      </w:pPr>
-      <w:r>
-        <w:t>Self Not On Track Response</w:t>
-      </w:r>
-    </w:p>
-    <w:p>
-      <w:r>
-        <w:rPr>
-          <w:rFonts w:ascii="Calibri" w:hAnsi="Calibri" w:eastAsia="Calibri"/>
-          <w:b w:val="0"/>
-          <w:i/>
-          <w:sz w:val="22"/>
-        </w:rPr>
-        <w:t>(deixar em branco se On Track)</w:t>
-      </w:r>
-    </w:p>
-    <w:p>
-      <w:pPr>
-        <w:pStyle w:val="Heading3"/>
-      </w:pPr>
-      <w:r>
-        <w:t>Priority Success Actuals (métricas)</w:t>
-      </w:r>
-    </w:p>
-    <w:tbl>
-      <w:tblPr>
-        <w:tblStyle w:val="TableGrid"/>
-        <w:tblW w:type="auto" w:w="0"/>
-        <w:tblLook w:firstColumn="1" w:firstRow="1" w:lastColumn="0" w:lastRow="0" w:noHBand="0" w:noVBand="1" w:val="04A0"/>
-      </w:tblPr>
-      <w:tblGrid>
-        <w:gridCol w:w="3249"/>
-        <w:gridCol w:w="3249"/>
-        <w:gridCol w:w="3249"/>
-      </w:tblGrid>
-      <w:tr>
-        <w:tc>
-          <w:tcPr>
-            <w:tcW w:type="dxa" w:w="3249"/>
-            <w:shd w:fill="1F3A5F" w:val="clear"/>
-          </w:tcPr>
-          <w:p>
-            <w:r>
-              <w:rPr>
-                <w:b/>
-                <w:color w:val="FFFFFF"/>
-                <w:sz w:val="20"/>
-              </w:rPr>
-            </w:r>
-            <w:r>
-              <w:rPr>
-                <w:rFonts w:ascii="Calibri" w:hAnsi="Calibri" w:eastAsia="Calibri"/>
-                <w:b/>
-                <w:i w:val="0"/>
-                <w:color w:val="FFFFFF"/>
-                <w:sz w:val="20"/>
-              </w:rPr>
-              <w:t>Métrica</w:t>
-            </w:r>
-          </w:p>
-        </w:tc>
-        <w:tc>
-          <w:tcPr>
-            <w:tcW w:type="dxa" w:w="3249"/>
-            <w:shd w:fill="1F3A5F" w:val="clear"/>
-          </w:tcPr>
-          <w:p>
-            <w:r>
-              <w:rPr>
-                <w:b/>
-                <w:color w:val="FFFFFF"/>
-                <w:sz w:val="20"/>
-              </w:rPr>
-            </w:r>
-            <w:r>
-              <w:rPr>
-                <w:rFonts w:ascii="Calibri" w:hAnsi="Calibri" w:eastAsia="Calibri"/>
-                <w:b/>
-                <w:i w:val="0"/>
-                <w:color w:val="FFFFFF"/>
-                <w:sz w:val="20"/>
-              </w:rPr>
-              <w:t>Target (já no WD)</w:t>
-            </w:r>
-          </w:p>
-        </w:tc>
-        <w:tc>
-          <w:tcPr>
-            <w:tcW w:type="dxa" w:w="3249"/>
-            <w:shd w:fill="1F3A5F" w:val="clear"/>
-          </w:tcPr>
-          <w:p>
-            <w:r>
-              <w:rPr>
-                <w:b/>
-                <w:color w:val="FFFFFF"/>
-                <w:sz w:val="20"/>
-              </w:rPr>
-            </w:r>
-            <w:r>
-              <w:rPr>
-                <w:rFonts w:ascii="Calibri" w:hAnsi="Calibri" w:eastAsia="Calibri"/>
-                <w:b/>
-                <w:i w:val="0"/>
-                <w:color w:val="FFFFFF"/>
-                <w:sz w:val="20"/>
-              </w:rPr>
-              <w:t>Actual (sugerido — ajuste)</w:t>
-            </w:r>
-          </w:p>
-        </w:tc>
-      </w:tr>
-      <w:tr>
-        <w:tc>
-          <w:tcPr>
-            <w:tcW w:type="dxa" w:w="3249"/>
-          </w:tcPr>
-          <w:p>
-            <w:r>
-              <w:rPr>
-                <w:sz w:val="20"/>
-              </w:rPr>
-            </w:r>
-            <w:r>
-              <w:rPr>
-                <w:rFonts w:ascii="Calibri" w:hAnsi="Calibri" w:eastAsia="Calibri"/>
-                <w:b w:val="0"/>
-                <w:i w:val="0"/>
-                <w:sz w:val="20"/>
-              </w:rPr>
-              <w:t>Project-Specific KPIs (Non-Financial)</w:t>
-            </w:r>
-          </w:p>
-        </w:tc>
-        <w:tc>
-          <w:tcPr>
-            <w:tcW w:type="dxa" w:w="3249"/>
-          </w:tcPr>
-          <w:p>
-            <w:r>
-              <w:rPr>
-                <w:sz w:val="20"/>
-              </w:rPr>
-            </w:r>
-            <w:r>
-              <w:rPr>
-                <w:rFonts w:ascii="Calibri" w:hAnsi="Calibri" w:eastAsia="Calibri"/>
-                <w:b w:val="0"/>
-                <w:i w:val="0"/>
-                <w:sz w:val="20"/>
-              </w:rPr>
-              <w:t>Demonstrar ganhos de produtividade, qualidade ou eficiência nas entregas por meio do uso de IA</w:t>
-            </w:r>
-          </w:p>
-        </w:tc>
-        <w:tc>
-          <w:tcPr>
-            <w:tcW w:type="dxa" w:w="3249"/>
-          </w:tcPr>
-          <w:p>
-            <w:r>
-              <w:rPr>
-                <w:sz w:val="20"/>
-              </w:rPr>
-            </w:r>
-            <w:r>
-              <w:rPr>
-                <w:rFonts w:ascii="Calibri" w:hAnsi="Calibri" w:eastAsia="Calibri"/>
-                <w:b w:val="0"/>
-                <w:i w:val="0"/>
-                <w:sz w:val="20"/>
-              </w:rPr>
-              <w:t>Ganhos observados em velocidade de implementação e redução de retrabalho no desenvolvimento mobile RD, com entregas de alta qualidade reconhecidas por Tech Lead, Senior Dev e QA no período</w:t>
-            </w:r>
-          </w:p>
-        </w:tc>
-      </w:tr>
-      <w:tr>
-        <w:tc>
-          <w:tcPr>
-            <w:tcW w:type="dxa" w:w="3249"/>
-            <w:shd w:fill="F3F6FA" w:val="clear"/>
-          </w:tcPr>
-          <w:p>
-            <w:r>
-              <w:rPr>
-                <w:sz w:val="20"/>
-              </w:rPr>
-            </w:r>
-            <w:r>
-              <w:rPr>
-                <w:rFonts w:ascii="Calibri" w:hAnsi="Calibri" w:eastAsia="Calibri"/>
-                <w:b w:val="0"/>
-                <w:i w:val="0"/>
-                <w:sz w:val="20"/>
-              </w:rPr>
-              <w:t>AI Tool Usage</w:t>
-            </w:r>
-          </w:p>
-        </w:tc>
-        <w:tc>
-          <w:tcPr>
-            <w:tcW w:type="dxa" w:w="3249"/>
-            <w:shd w:fill="F3F6FA" w:val="clear"/>
-          </w:tcPr>
-          <w:p>
-            <w:r>
-              <w:rPr>
-                <w:sz w:val="20"/>
-              </w:rPr>
-            </w:r>
-            <w:r>
-              <w:rPr>
-                <w:rFonts w:ascii="Calibri" w:hAnsi="Calibri" w:eastAsia="Calibri"/>
-                <w:b w:val="0"/>
-                <w:i w:val="0"/>
-                <w:sz w:val="20"/>
-              </w:rPr>
-              <w:t>Utilizar ferramentas de IA de forma recorrente no desenvolvimento</w:t>
-            </w:r>
-          </w:p>
-        </w:tc>
-        <w:tc>
-          <w:tcPr>
-            <w:tcW w:type="dxa" w:w="3249"/>
-            <w:shd w:fill="F3F6FA" w:val="clear"/>
-          </w:tcPr>
-          <w:p>
-            <w:r>
-              <w:rPr>
-                <w:sz w:val="20"/>
-              </w:rPr>
-            </w:r>
-            <w:r>
-              <w:rPr>
-                <w:rFonts w:ascii="Calibri" w:hAnsi="Calibri" w:eastAsia="Calibri"/>
-                <w:b w:val="0"/>
-                <w:i w:val="0"/>
-                <w:sz w:val="20"/>
-              </w:rPr>
-              <w:t>Uso recorrente de Microsoft Copilot e práticas de IA no dia a dia de desenvolvimento mobile na RD Saúde</w:t>
-            </w:r>
-          </w:p>
-        </w:tc>
-      </w:tr>
-      <w:tr>
-        <w:tc>
-          <w:tcPr>
-            <w:tcW w:type="dxa" w:w="3249"/>
-          </w:tcPr>
-          <w:p>
-            <w:r>
-              <w:rPr>
-                <w:sz w:val="20"/>
-              </w:rPr>
-            </w:r>
-            <w:r>
-              <w:rPr>
-                <w:rFonts w:ascii="Calibri" w:hAnsi="Calibri" w:eastAsia="Calibri"/>
-                <w:b w:val="0"/>
-                <w:i w:val="0"/>
-                <w:sz w:val="20"/>
-              </w:rPr>
-              <w:t>High Quality Deliverables / Client Delivery</w:t>
-            </w:r>
-          </w:p>
-        </w:tc>
-        <w:tc>
-          <w:tcPr>
-            <w:tcW w:type="dxa" w:w="3249"/>
-          </w:tcPr>
-          <w:p>
-            <w:r>
-              <w:rPr>
-                <w:sz w:val="20"/>
-              </w:rPr>
-            </w:r>
-            <w:r>
-              <w:rPr>
-                <w:rFonts w:ascii="Calibri" w:hAnsi="Calibri" w:eastAsia="Calibri"/>
-                <w:b w:val="0"/>
-                <w:i w:val="0"/>
-                <w:sz w:val="20"/>
-              </w:rPr>
-              <w:t>Aplicar IA e Copilot para melhorar qualidade e eficiência</w:t>
-            </w:r>
-          </w:p>
-        </w:tc>
-        <w:tc>
-          <w:tcPr>
-            <w:tcW w:type="dxa" w:w="3249"/>
-          </w:tcPr>
-          <w:p>
-            <w:r>
-              <w:rPr>
-                <w:sz w:val="20"/>
-              </w:rPr>
-            </w:r>
-            <w:r>
-              <w:rPr>
-                <w:rFonts w:ascii="Calibri" w:hAnsi="Calibri" w:eastAsia="Calibri"/>
-                <w:b w:val="0"/>
-                <w:i w:val="0"/>
-                <w:sz w:val="20"/>
-              </w:rPr>
-              <w:t>Qualidade técnica e sustentabilidade das entregas destacadas em feedbacks espontâneos (Anderson, Sergio, João Victor); colaboração Dev–QA facilitando o fluxo de demandas</w:t>
-            </w:r>
-          </w:p>
-        </w:tc>
-      </w:tr>
-    </w:tbl>
-    <w:p/>
-    <w:p>
-      <w:pPr>
-        <w:pBdr>
-          <w:bottom w:val="single" w:sz="6" w:space="1" w:color="CCCCCC"/>
-        </w:pBdr>
-      </w:pPr>
-    </w:p>
-    <w:p>
-      <w:pPr>
-        <w:pStyle w:val="Heading1"/>
-      </w:pPr>
-      <w:r>
-        <w:t>2) Capacitação em IA aplicada ao desenvolvimento</w:t>
-      </w:r>
-    </w:p>
-    <w:p>
-      <w:r>
-        <w:rPr>
-          <w:rFonts w:ascii="Calibri" w:hAnsi="Calibri" w:eastAsia="Calibri"/>
-          <w:b/>
-          <w:i w:val="0"/>
-          <w:sz w:val="22"/>
-        </w:rPr>
-        <w:t>Categoria:</w:t>
-      </w:r>
-      <w:r>
-        <w:rPr>
-          <w:rFonts w:ascii="Calibri" w:hAnsi="Calibri" w:eastAsia="Calibri"/>
-          <w:b w:val="0"/>
-          <w:i w:val="0"/>
-          <w:sz w:val="22"/>
-        </w:rPr>
-        <w:t xml:space="preserve"> AI Enablement</w:t>
-      </w:r>
-    </w:p>
-    <w:p>
-      <w:pPr>
-        <w:pStyle w:val="Heading3"/>
-      </w:pPr>
-      <w:r>
-        <w:t>Self Reflection Comments (colar)</w:t>
-      </w:r>
-    </w:p>
-    <w:p>
-      <w:pPr>
-        <w:ind w:left="425"/>
-      </w:pPr>
-      <w:r>
-        <w:rPr>
-          <w:rFonts w:ascii="Calibri" w:hAnsi="Calibri" w:eastAsia="Calibri"/>
-          <w:b/>
-          <w:i w:val="0"/>
-          <w:color w:val="555555"/>
-          <w:sz w:val="22"/>
-        </w:rPr>
-        <w:t>Se você JÁ tirou AI-900 e/ou Copilot:</w:t>
-      </w:r>
-      <w:r>
-        <w:rPr>
-          <w:rFonts w:ascii="Calibri" w:hAnsi="Calibri" w:eastAsia="Calibri"/>
-          <w:b w:val="0"/>
-          <w:i/>
-          <w:color w:val="555555"/>
-          <w:sz w:val="22"/>
-        </w:rPr>
-        <w:t xml:space="preserve"> use o bloco A.   </w:t>
-      </w:r>
-      <w:r>
-        <w:rPr>
-          <w:rFonts w:ascii="Calibri" w:hAnsi="Calibri" w:eastAsia="Calibri"/>
-          <w:b/>
-          <w:i w:val="0"/>
-          <w:color w:val="555555"/>
-          <w:sz w:val="22"/>
-        </w:rPr>
-        <w:t>Se AINDA NÃO tirou alguma:</w:t>
-      </w:r>
-      <w:r>
-        <w:rPr>
-          <w:rFonts w:ascii="Calibri" w:hAnsi="Calibri" w:eastAsia="Calibri"/>
-          <w:b w:val="0"/>
-          <w:i/>
-          <w:color w:val="555555"/>
-          <w:sz w:val="22"/>
-        </w:rPr>
-        <w:t xml:space="preserve"> use o bloco B (honesto — melhor que inventar).</w:t>
-      </w:r>
-    </w:p>
-    <w:p>
-      <w:pPr>
-        <w:pStyle w:val="Heading3"/>
-      </w:pPr>
-      <w:r>
-        <w:t>Bloco A — se concluiu as certificações</w:t>
-      </w:r>
-    </w:p>
-    <w:p>
-      <w:r>
-        <w:rPr>
-          <w:rFonts w:ascii="Calibri" w:hAnsi="Calibri" w:eastAsia="Calibri"/>
-          <w:b w:val="0"/>
-          <w:i w:val="0"/>
-          <w:sz w:val="22"/>
-        </w:rPr>
-        <w:t>Durante o FY26, foquei em capacitar-me em Inteligência Artificial aplicada ao desenvolvimento, obtendo/avançando nas certificações Microsoft AI-900 e Microsoft Copilot e aplicando o aprendizado diretamente no projeto da RD Saúde.</w:t>
-      </w:r>
-    </w:p>
-    <w:p>
-      <w:r>
-        <w:rPr>
-          <w:rFonts w:ascii="Calibri" w:hAnsi="Calibri" w:eastAsia="Calibri"/>
-          <w:b w:val="0"/>
-          <w:i w:val="0"/>
-          <w:sz w:val="22"/>
-        </w:rPr>
-        <w:t>O que deu certo: concluí a trilha de capacitação planejada e incorporei as ferramentas de IA no fluxo diário de desenvolvimento mobile, com ganho de produtividade e qualidade. A capacitação não ficou teórica: o uso contínuo de Copilot no dia a dia e a melhoria das entregas foram percebidos pelo time (qualidade técnica, eficiência e colaboração).</w:t>
-      </w:r>
-    </w:p>
-    <w:p>
-      <w:r>
-        <w:rPr>
-          <w:rFonts w:ascii="Calibri" w:hAnsi="Calibri" w:eastAsia="Calibri"/>
-          <w:b w:val="0"/>
-          <w:i w:val="0"/>
-          <w:sz w:val="22"/>
-        </w:rPr>
-        <w:t>O que poderia ser melhor: aprofundar especializações além do foundations e formalizar um playbook interno de prompts/boas práticas para o time mobile.</w:t>
-      </w:r>
-    </w:p>
-    <w:p>
-      <w:r>
-        <w:rPr>
-          <w:rFonts w:ascii="Calibri" w:hAnsi="Calibri" w:eastAsia="Calibri"/>
-          <w:b w:val="0"/>
-          <w:i w:val="0"/>
-          <w:sz w:val="22"/>
-        </w:rPr>
-        <w:t>Próximos passos: manter atualização contínua em IA; expandir compartilhamento da capacitação com o time; conectar a trilha de IA com evolução em arquitetura mobile.</w:t>
-      </w:r>
-    </w:p>
-    <w:p>
-      <w:pPr>
-        <w:pStyle w:val="Heading3"/>
-      </w:pPr>
-      <w:r>
-        <w:t>Bloco B — se ainda está em andamento (recomendado se badge incompleto)</w:t>
-      </w:r>
-    </w:p>
-    <w:p>
-      <w:r>
-        <w:rPr>
-          <w:rFonts w:ascii="Calibri" w:hAnsi="Calibri" w:eastAsia="Calibri"/>
-          <w:b w:val="0"/>
-          <w:i w:val="0"/>
-          <w:sz w:val="22"/>
-        </w:rPr>
-        <w:t>Durante o FY26, foquei em capacitar-me em Inteligência Artificial aplicada ao desenvolvimento, com meta de certificação Microsoft AI-900 e Microsoft Copilot, e — principalmente — com aplicação prática das ferramentas de IA no dia a dia do desenvolvimento mobile na RD Saúde.</w:t>
-      </w:r>
-    </w:p>
-    <w:p>
-      <w:r>
-        <w:rPr>
-          <w:rFonts w:ascii="Calibri" w:hAnsi="Calibri" w:eastAsia="Calibri"/>
-          <w:b w:val="0"/>
-          <w:i w:val="0"/>
-          <w:sz w:val="22"/>
-        </w:rPr>
-        <w:t>O que deu certo: evoluí de forma consistente no uso prático de IA/Copilot no fluxo de trabalho, integrando a ferramenta às entregas e à melhoria de qualidade/eficiência. Mesmo com a certificação formal ainda em andamento/parcial, a capacitação aplicada já gerou resultado no projeto, alinhado aos feedbacks de qualidade técnica e produtividade do time.</w:t>
-      </w:r>
-    </w:p>
-    <w:p>
-      <w:r>
-        <w:rPr>
-          <w:rFonts w:ascii="Calibri" w:hAnsi="Calibri" w:eastAsia="Calibri"/>
-          <w:b w:val="0"/>
-          <w:i w:val="0"/>
-          <w:sz w:val="22"/>
-        </w:rPr>
-        <w:t>O que poderia ser melhor: concluir integralmente as certificações planejadas até o fechamento do ciclo e registrar melhor a evidência da trilha (horas de estudo, simulados, badge). O aprendizado prático avançou; a formalização do badge precisa acompanhar.</w:t>
-      </w:r>
-    </w:p>
-    <w:p>
-      <w:r>
-        <w:rPr>
-          <w:rFonts w:ascii="Calibri" w:hAnsi="Calibri" w:eastAsia="Calibri"/>
-          <w:b w:val="0"/>
-          <w:i w:val="0"/>
-          <w:sz w:val="22"/>
-        </w:rPr>
-        <w:t>Próximos passos: finalizar AI-900 e Copilot no prazo do FY26; consolidar o uso diário de IA; compartilhar aprendizados da capacitação com o time (conexão com a prioridade de disseminação).</w:t>
-      </w:r>
-    </w:p>
-    <w:p>
-      <w:pPr>
-        <w:pStyle w:val="Heading3"/>
-      </w:pPr>
-      <w:r>
-        <w:t>Self Reflection — Level of Impact</w:t>
-      </w:r>
-    </w:p>
-    <w:p>
-      <w:pPr>
-        <w:pStyle w:val="ListBullet"/>
-      </w:pPr>
-      <w:r>
-        <w:rPr>
-          <w:rFonts w:ascii="Calibri" w:hAnsi="Calibri" w:eastAsia="Calibri"/>
-          <w:b w:val="0"/>
-          <w:i w:val="0"/>
-          <w:sz w:val="22"/>
-        </w:rPr>
-        <w:t xml:space="preserve">Bloco A: </w:t>
-      </w:r>
-      <w:r>
-        <w:rPr>
-          <w:rFonts w:ascii="Calibri" w:hAnsi="Calibri" w:eastAsia="Calibri"/>
-          <w:b/>
-          <w:i w:val="0"/>
-          <w:sz w:val="22"/>
-        </w:rPr>
-        <w:t>8</w:t>
-      </w:r>
-    </w:p>
-    <w:p>
-      <w:pPr>
-        <w:pStyle w:val="ListBullet"/>
-      </w:pPr>
-      <w:r>
-        <w:rPr>
-          <w:rFonts w:ascii="Calibri" w:hAnsi="Calibri" w:eastAsia="Calibri"/>
-          <w:b w:val="0"/>
-          <w:i w:val="0"/>
-          <w:sz w:val="22"/>
-        </w:rPr>
-        <w:t xml:space="preserve">Bloco B: </w:t>
-      </w:r>
-      <w:r>
-        <w:rPr>
-          <w:rFonts w:ascii="Calibri" w:hAnsi="Calibri" w:eastAsia="Calibri"/>
-          <w:b/>
-          <w:i w:val="0"/>
-          <w:sz w:val="22"/>
-        </w:rPr>
-        <w:t>6–7</w:t>
-      </w:r>
-      <w:r>
-        <w:rPr>
-          <w:rFonts w:ascii="Calibri" w:hAnsi="Calibri" w:eastAsia="Calibri"/>
-          <w:b w:val="0"/>
-          <w:i w:val="0"/>
-          <w:sz w:val="22"/>
-        </w:rPr>
-        <w:t xml:space="preserve"> (aprendizado aplicado forte; badge parcial)</w:t>
-      </w:r>
-    </w:p>
-    <w:p>
-      <w:pPr>
-        <w:pStyle w:val="Heading3"/>
-      </w:pPr>
-      <w:r>
-        <w:t>Self On Track</w:t>
-      </w:r>
-    </w:p>
-    <w:p>
-      <w:pPr>
-        <w:pStyle w:val="ListBullet"/>
-      </w:pPr>
-      <w:r>
-        <w:rPr>
-          <w:rFonts w:ascii="Calibri" w:hAnsi="Calibri" w:eastAsia="Calibri"/>
-          <w:b w:val="0"/>
-          <w:i w:val="0"/>
-          <w:sz w:val="22"/>
-        </w:rPr>
-        <w:t xml:space="preserve">Bloco A: </w:t>
-      </w:r>
-      <w:r>
-        <w:rPr>
-          <w:rFonts w:ascii="Calibri" w:hAnsi="Calibri" w:eastAsia="Calibri"/>
-          <w:b/>
-          <w:i w:val="0"/>
-          <w:sz w:val="22"/>
-        </w:rPr>
-        <w:t>Yes</w:t>
-      </w:r>
-    </w:p>
-    <w:p>
-      <w:pPr>
-        <w:pStyle w:val="ListBullet"/>
-      </w:pPr>
-      <w:r>
-        <w:rPr>
-          <w:rFonts w:ascii="Calibri" w:hAnsi="Calibri" w:eastAsia="Calibri"/>
-          <w:b w:val="0"/>
-          <w:i w:val="0"/>
-          <w:sz w:val="22"/>
-        </w:rPr>
-        <w:t xml:space="preserve">Bloco B: </w:t>
-      </w:r>
-      <w:r>
-        <w:rPr>
-          <w:rFonts w:ascii="Calibri" w:hAnsi="Calibri" w:eastAsia="Calibri"/>
-          <w:b/>
-          <w:i w:val="0"/>
-          <w:sz w:val="22"/>
-        </w:rPr>
-        <w:t>Yes</w:t>
-      </w:r>
-      <w:r>
-        <w:rPr>
-          <w:rFonts w:ascii="Calibri" w:hAnsi="Calibri" w:eastAsia="Calibri"/>
-          <w:b w:val="0"/>
-          <w:i w:val="0"/>
-          <w:sz w:val="22"/>
-        </w:rPr>
-        <w:t xml:space="preserve"> se o uso prático está contínuo e a certificação tem plano claro; senão </w:t>
-      </w:r>
-      <w:r>
-        <w:rPr>
-          <w:rFonts w:ascii="Calibri" w:hAnsi="Calibri" w:eastAsia="Calibri"/>
-          <w:b/>
-          <w:i w:val="0"/>
-          <w:sz w:val="22"/>
-        </w:rPr>
-        <w:t>Partially</w:t>
-      </w:r>
-      <w:r>
-        <w:rPr>
-          <w:rFonts w:ascii="Calibri" w:hAnsi="Calibri" w:eastAsia="Calibri"/>
-          <w:b w:val="0"/>
-          <w:i w:val="0"/>
-          <w:sz w:val="22"/>
-        </w:rPr>
-        <w:t xml:space="preserve"> e explique no comentário.</w:t>
-      </w:r>
-    </w:p>
-    <w:p>
-      <w:pPr>
-        <w:pStyle w:val="Heading3"/>
-      </w:pPr>
-      <w:r>
-        <w:t>Priority Success Actuals</w:t>
+        <w:t>Actuals (métricas)</w:t>
       </w:r>
     </w:p>
     <w:tbl>
@@ -1505,7 +522,7 @@
                 <w:color w:val="FFFFFF"/>
                 <w:sz w:val="20"/>
               </w:rPr>
-              <w:t>Actual sugerido</w:t>
+              <w:t>Actual</w:t>
             </w:r>
           </w:p>
         </w:tc>
@@ -1528,7 +545,7 @@
                 <w:i w:val="0"/>
                 <w:sz w:val="20"/>
               </w:rPr>
-              <w:t>AI Proficiency / Skills</w:t>
+              <w:t>Project-Specific KPIs</w:t>
             </w:r>
           </w:p>
         </w:tc>
@@ -1549,7 +566,7 @@
                 <w:i w:val="0"/>
                 <w:sz w:val="20"/>
               </w:rPr>
-              <w:t>Evolução prática contínua em competências de IA aplicadas ao desenvolvimento mobile (Copilot no fluxo diário); [inserir: badge AI-900/Copilot obtido OU % de progresso / data prevista]</w:t>
+              <w:t>Ganhos de produtividade, qualidade e eficiência nas entregas mobile RD com uso do Cursor; qualidade reconhecida por Tech Lead, Senior Dev e QA</w:t>
             </w:r>
           </w:p>
         </w:tc>
@@ -1573,7 +590,7 @@
                 <w:i w:val="0"/>
                 <w:sz w:val="20"/>
               </w:rPr>
-              <w:t>Skills/Specializations/Learning</w:t>
+              <w:t>AI Tool Usage</w:t>
             </w:r>
           </w:p>
         </w:tc>
@@ -1595,7 +612,25 @@
                 <w:i w:val="0"/>
                 <w:sz w:val="20"/>
               </w:rPr>
-              <w:t>[Inserir: “Certificações AI-900 e Copilot concluídas” OU “Em andamento — estudo + aplicação prática contínua; conclusão prevista até fim do FY26”]</w:t>
+              <w:t xml:space="preserve">Uso recorrente do </w:t>
+            </w:r>
+            <w:r>
+              <w:rPr>
+                <w:rFonts w:ascii="Calibri" w:hAnsi="Calibri" w:eastAsia="Calibri"/>
+                <w:b/>
+                <w:i w:val="0"/>
+                <w:sz w:val="20"/>
+              </w:rPr>
+              <w:t>Cursor</w:t>
+            </w:r>
+            <w:r>
+              <w:rPr>
+                <w:rFonts w:ascii="Calibri" w:hAnsi="Calibri" w:eastAsia="Calibri"/>
+                <w:b w:val="0"/>
+                <w:i w:val="0"/>
+                <w:sz w:val="20"/>
+              </w:rPr>
+              <w:t xml:space="preserve"> no desenvolvimento mobile na RD Saúde (implementação, compreensão de código, redução de retrabalho)</w:t>
             </w:r>
           </w:p>
         </w:tc>
@@ -1618,7 +653,7 @@
                 <w:i w:val="0"/>
                 <w:sz w:val="20"/>
               </w:rPr>
-              <w:t>AI Tool Usage</w:t>
+              <w:t>High Quality Deliverables</w:t>
             </w:r>
           </w:p>
         </w:tc>
@@ -1639,7 +674,7 @@
                 <w:i w:val="0"/>
                 <w:sz w:val="20"/>
               </w:rPr>
-              <w:t>Uso contínuo de Microsoft Copilot no desenvolvimento mobile RD, integrado ao fluxo diário de implementação, review e resolução de demandas</w:t>
+              <w:t>Qualidade técnica e sustentabilidade das entregas destacadas em feedbacks (Anderson, Sergio, João Victor); colaboração Dev–QA</w:t>
             </w:r>
           </w:p>
         </w:tc>
@@ -1658,7 +693,7 @@
         <w:pStyle w:val="Heading1"/>
       </w:pPr>
       <w:r>
-        <w:t>3) Contribuição para a comunidade</w:t>
+        <w:t>2) Capacitação em IA aplicada ao desenvolvimento</w:t>
       </w:r>
     </w:p>
     <w:p>
@@ -1678,7 +713,7 @@
           <w:i w:val="0"/>
           <w:sz w:val="22"/>
         </w:rPr>
-        <w:t xml:space="preserve"> Community</w:t>
+        <w:t xml:space="preserve"> AI Enablement</w:t>
       </w:r>
     </w:p>
     <w:p>
@@ -1686,42 +721,15 @@
         <w:pStyle w:val="Heading3"/>
       </w:pPr>
       <w:r>
-        <w:t>Self Reflection Comments (colar)</w:t>
+        <w:t>Self Reflection Comments — use conforme o badge</w:t>
       </w:r>
     </w:p>
     <w:p>
       <w:pPr>
-        <w:ind w:left="425"/>
+        <w:pStyle w:val="Heading3"/>
       </w:pPr>
       <w:r>
-        <w:rPr>
-          <w:rFonts w:ascii="Calibri" w:hAnsi="Calibri" w:eastAsia="Calibri"/>
-          <w:b w:val="0"/>
-          <w:i/>
-          <w:color w:val="555555"/>
-          <w:sz w:val="22"/>
-        </w:rPr>
-        <w:t xml:space="preserve">Inclua o que for fato. Se o voluntariado externo foi limitado, use a atuação como </w:t>
-      </w:r>
-      <w:r>
-        <w:rPr>
-          <w:rFonts w:ascii="Calibri" w:hAnsi="Calibri" w:eastAsia="Calibri"/>
-          <w:b/>
-          <w:i w:val="0"/>
-          <w:color w:val="555555"/>
-          <w:sz w:val="22"/>
-        </w:rPr>
-        <w:t>People Lead</w:t>
-      </w:r>
-      <w:r>
-        <w:rPr>
-          <w:rFonts w:ascii="Calibri" w:hAnsi="Calibri" w:eastAsia="Calibri"/>
-          <w:b w:val="0"/>
-          <w:i/>
-          <w:color w:val="555555"/>
-          <w:sz w:val="22"/>
-        </w:rPr>
-        <w:t xml:space="preserve"> + disseminação responsável de IA como evidência principal (é cidadania/comunidade interna válida). Ajuste se tiver horas de voluntariado externo.</w:t>
+        <w:t>Se AINDA não concluiu AI-900/Copilot (recomendado se incompleto) · Impacto 6–7 · On Track: Yes</w:t>
       </w:r>
     </w:p>
     <w:p>
@@ -1732,7 +740,25 @@
           <w:i w:val="0"/>
           <w:sz w:val="22"/>
         </w:rPr>
-        <w:t>Durante o FY26, contribuí para a disseminação de conhecimento em tecnologia e Inteligência Artificial e para o fortalecimento da comunidade de reinventores, promovendo uso responsável de IA e desenvolvimento de habilidades digitais.</w:t>
+        <w:t xml:space="preserve">Durante o FY26, foquei em capacitar-me em Inteligência Artificial aplicada ao desenvolvimento, com meta de certificação Microsoft AI-900 e Microsoft Copilot, e com aplicação prática intensa de IA no cliente RD Saúde por meio do </w:t>
+      </w:r>
+      <w:r>
+        <w:rPr>
+          <w:rFonts w:ascii="Calibri" w:hAnsi="Calibri" w:eastAsia="Calibri"/>
+          <w:b/>
+          <w:i w:val="0"/>
+          <w:sz w:val="22"/>
+        </w:rPr>
+        <w:t>Cursor</w:t>
+      </w:r>
+      <w:r>
+        <w:rPr>
+          <w:rFonts w:ascii="Calibri" w:hAnsi="Calibri" w:eastAsia="Calibri"/>
+          <w:b w:val="0"/>
+          <w:i w:val="0"/>
+          <w:sz w:val="22"/>
+        </w:rPr>
+        <w:t>.</w:t>
       </w:r>
     </w:p>
     <w:p>
@@ -1743,7 +769,7 @@
           <w:i w:val="0"/>
           <w:sz w:val="22"/>
         </w:rPr>
-        <w:t>O que deu certo: apoiei o compartilhamento de conhecimento em IA/Copilot no contexto de trabalho e assumi atuação como People Lead, mentorando profissionais (incluindo acompanhamento de carreira, ciclo de performance e orientação para autoavaliação no Workday). Essa atuação fortalece a comunidade interna, a inclusão de desenvolvimento de pessoas e o uso responsável de práticas de IA no dia a dia. Também mantive postura colaborativa reconhecida por pares e parceiros (incluindo apoio a colegas e facilitação Dev–QA), o que reforça impacto positivo além da entrega individual.</w:t>
+        <w:t>O que deu certo: evoluí de forma consistente no uso prático de IA no fluxo de trabalho mobile, integrando o Cursor às entregas e à melhoria de qualidade/eficiência. A capacitação aplicada já gerou resultado no projeto — alinhado aos feedbacks de qualidade técnica e produtividade — mesmo com a certificação formal Microsoft ainda em andamento/parcial.</w:t>
       </w:r>
     </w:p>
     <w:p>
@@ -1754,7 +780,7 @@
           <w:i w:val="0"/>
           <w:sz w:val="22"/>
         </w:rPr>
-        <w:t>O que poderia ser melhor: ampliar participação em ações formais de voluntariado educacional externo e registrar de forma mais estruturada horas/iniciativas de comunidade para tornar a métrica ainda mais clara.</w:t>
+        <w:t>O que poderia ser melhor: concluir integralmente as certificações Microsoft planejadas (AI-900 e Copilot) e registrar melhor a trilha formal (estudo, simulados, badge). O aprendizado prático com Cursor avançou; a formalização do badge precisa acompanhar.</w:t>
       </w:r>
     </w:p>
     <w:p>
@@ -1765,7 +791,7 @@
           <w:i w:val="0"/>
           <w:sz w:val="22"/>
         </w:rPr>
-        <w:t>Próximos passos: manter a mentoria como People Lead; apoiar iniciativas de educação tecnológica/IA sempre que possível; continuar promovendo uso ético e responsável de IA alinhado aos valores Accenture/Avanade.</w:t>
+        <w:t>Próximos passos: finalizar AI-900 e certificação Copilot no prazo do FY26; consolidar o uso diário do Cursor; compartilhar aprendizados práticos de IA com o time.</w:t>
       </w:r>
     </w:p>
     <w:p>
@@ -1773,10 +799,19 @@
         <w:pStyle w:val="Heading3"/>
       </w:pPr>
       <w:r>
-        <w:t>Self Reflection — Level of Impact</w:t>
+        <w:t>Se JÁ concluiu as certificações · Impacto 8 · On Track: Yes</w:t>
       </w:r>
     </w:p>
     <w:p>
+      <w:r>
+        <w:rPr>
+          <w:rFonts w:ascii="Calibri" w:hAnsi="Calibri" w:eastAsia="Calibri"/>
+          <w:b w:val="0"/>
+          <w:i w:val="0"/>
+          <w:sz w:val="22"/>
+        </w:rPr>
+        <w:t xml:space="preserve">Durante o FY26, foquei em capacitar-me em Inteligência Artificial aplicada ao desenvolvimento, avançando nas certificações Microsoft AI-900 e Microsoft Copilot e aplicando o aprendizado no projeto da RD Saúde com o </w:t>
+      </w:r>
       <w:r>
         <w:rPr>
           <w:rFonts w:ascii="Calibri" w:hAnsi="Calibri" w:eastAsia="Calibri"/>
@@ -1784,7 +819,7 @@
           <w:i w:val="0"/>
           <w:sz w:val="22"/>
         </w:rPr>
-        <w:t>7</w:t>
+        <w:t>Cursor</w:t>
       </w:r>
       <w:r>
         <w:rPr>
@@ -1793,7 +828,40 @@
           <w:i w:val="0"/>
           <w:sz w:val="22"/>
         </w:rPr>
-        <w:t xml:space="preserve"> (subir para 8 se tiver voluntariado externo concreto com horas)</w:t>
+        <w:t xml:space="preserve"> no dia a dia.</w:t>
+      </w:r>
+    </w:p>
+    <w:p>
+      <w:r>
+        <w:rPr>
+          <w:rFonts w:ascii="Calibri" w:hAnsi="Calibri" w:eastAsia="Calibri"/>
+          <w:b w:val="0"/>
+          <w:i w:val="0"/>
+          <w:sz w:val="22"/>
+        </w:rPr>
+        <w:t>O que deu certo: concluí a trilha de capacitação planejada e incorporei IA de forma contínua no desenvolvimento mobile via Cursor, com ganho de produtividade e qualidade percebido pelo time.</w:t>
+      </w:r>
+    </w:p>
+    <w:p>
+      <w:r>
+        <w:rPr>
+          <w:rFonts w:ascii="Calibri" w:hAnsi="Calibri" w:eastAsia="Calibri"/>
+          <w:b w:val="0"/>
+          <w:i w:val="0"/>
+          <w:sz w:val="22"/>
+        </w:rPr>
+        <w:t>O que poderia ser melhor: aprofundar especializações além do foundations e formalizar um playbook interno de prompts/boas práticas (Cursor) para o time mobile.</w:t>
+      </w:r>
+    </w:p>
+    <w:p>
+      <w:r>
+        <w:rPr>
+          <w:rFonts w:ascii="Calibri" w:hAnsi="Calibri" w:eastAsia="Calibri"/>
+          <w:b w:val="0"/>
+          <w:i w:val="0"/>
+          <w:sz w:val="22"/>
+        </w:rPr>
+        <w:t>Próximos passos: manter atualização contínua em IA; expandir compartilhamento da capacitação prática com o time; conectar a trilha de IA com evolução em arquitetura mobile.</w:t>
       </w:r>
     </w:p>
     <w:p>
@@ -1801,26 +869,7 @@
         <w:pStyle w:val="Heading3"/>
       </w:pPr>
       <w:r>
-        <w:t>Self On Track</w:t>
-      </w:r>
-    </w:p>
-    <w:p>
-      <w:r>
-        <w:rPr>
-          <w:rFonts w:ascii="Calibri" w:hAnsi="Calibri" w:eastAsia="Calibri"/>
-          <w:b/>
-          <w:i w:val="0"/>
-          <w:sz w:val="22"/>
-        </w:rPr>
-        <w:t>Yes</w:t>
-      </w:r>
-    </w:p>
-    <w:p>
-      <w:pPr>
-        <w:pStyle w:val="Heading3"/>
-      </w:pPr>
-      <w:r>
-        <w:t>Priority Success Actuals</w:t>
+        <w:t>Actuals</w:t>
       </w:r>
     </w:p>
     <w:tbl>
@@ -1880,7 +929,7 @@
                 <w:color w:val="FFFFFF"/>
                 <w:sz w:val="20"/>
               </w:rPr>
-              <w:t>Actual sugerido</w:t>
+              <w:t>Actual</w:t>
             </w:r>
           </w:p>
         </w:tc>
@@ -1903,7 +952,7 @@
                 <w:i w:val="0"/>
                 <w:sz w:val="20"/>
               </w:rPr>
-              <w:t>Other (Non-Financial)</w:t>
+              <w:t>AI Proficiency / Skills</w:t>
             </w:r>
           </w:p>
         </w:tc>
@@ -1924,7 +973,25 @@
                 <w:i w:val="0"/>
                 <w:sz w:val="20"/>
               </w:rPr>
-              <w:t>Promoção do uso responsável de IA no dia a dia (Copilot com qualidade, colaboração e boas práticas), alinhado aos valores da empresa</w:t>
+              <w:t xml:space="preserve">Evolução prática contínua em IA aplicada ao mobile com </w:t>
+            </w:r>
+            <w:r>
+              <w:rPr>
+                <w:rFonts w:ascii="Calibri" w:hAnsi="Calibri" w:eastAsia="Calibri"/>
+                <w:b/>
+                <w:i w:val="0"/>
+                <w:sz w:val="20"/>
+              </w:rPr>
+              <w:t>Cursor</w:t>
+            </w:r>
+            <w:r>
+              <w:rPr>
+                <w:rFonts w:ascii="Calibri" w:hAnsi="Calibri" w:eastAsia="Calibri"/>
+                <w:b w:val="0"/>
+                <w:i w:val="0"/>
+                <w:sz w:val="20"/>
+              </w:rPr>
+              <w:t xml:space="preserve"> na RD; [badge AI-900/Copilot obtido OU em andamento]</w:t>
             </w:r>
           </w:p>
         </w:tc>
@@ -1948,7 +1015,7 @@
                 <w:i w:val="0"/>
                 <w:sz w:val="20"/>
               </w:rPr>
-              <w:t>Community Volunteering</w:t>
+              <w:t>Skills/Specializations/Learning</w:t>
             </w:r>
           </w:p>
         </w:tc>
@@ -1970,7 +1037,7 @@
                 <w:i w:val="0"/>
                 <w:sz w:val="20"/>
               </w:rPr>
-              <w:t>Apoio a desenvolvimento de pessoas como People Lead (mentoria e orientação de carreira/ciclo); [somar voluntariado externo se houver]</w:t>
+              <w:t>[Certificações concluídas OU em andamento com aplicação prática contínua via Cursor]</w:t>
             </w:r>
           </w:p>
         </w:tc>
@@ -1993,7 +1060,7 @@
                 <w:i w:val="0"/>
                 <w:sz w:val="20"/>
               </w:rPr>
-              <w:t>Social &amp; Environmental Citizenship</w:t>
+              <w:t>AI Tool Usage</w:t>
             </w:r>
           </w:p>
         </w:tc>
@@ -2014,7 +1081,25 @@
                 <w:i w:val="0"/>
                 <w:sz w:val="20"/>
               </w:rPr>
-              <w:t>Disseminação de conhecimento em tecnologia/IA por meio de mentoria, apoio a colegas e orientação de profissionais da prática</w:t>
+              <w:t xml:space="preserve">Uso contínuo do </w:t>
+            </w:r>
+            <w:r>
+              <w:rPr>
+                <w:rFonts w:ascii="Calibri" w:hAnsi="Calibri" w:eastAsia="Calibri"/>
+                <w:b/>
+                <w:i w:val="0"/>
+                <w:sz w:val="20"/>
+              </w:rPr>
+              <w:t>Cursor</w:t>
+            </w:r>
+            <w:r>
+              <w:rPr>
+                <w:rFonts w:ascii="Calibri" w:hAnsi="Calibri" w:eastAsia="Calibri"/>
+                <w:b w:val="0"/>
+                <w:i w:val="0"/>
+                <w:sz w:val="20"/>
+              </w:rPr>
+              <w:t xml:space="preserve"> no desenvolvimento mobile RD, integrado ao fluxo diário</w:t>
             </w:r>
           </w:p>
         </w:tc>
@@ -2033,7 +1118,7 @@
         <w:pStyle w:val="Heading1"/>
       </w:pPr>
       <w:r>
-        <w:t>4) Disseminação de conhecimento em IA e inovação</w:t>
+        <w:t>3) Contribuição para a comunidade</w:t>
       </w:r>
     </w:p>
     <w:p>
@@ -2053,7 +1138,16 @@
           <w:i w:val="0"/>
           <w:sz w:val="22"/>
         </w:rPr>
-        <w:t xml:space="preserve"> Great Place to Work for Reinventors</w:t>
+        <w:t xml:space="preserve"> Community · </w:t>
+      </w:r>
+      <w:r>
+        <w:rPr>
+          <w:rFonts w:ascii="Calibri" w:hAnsi="Calibri" w:eastAsia="Calibri"/>
+          <w:b/>
+          <w:i w:val="0"/>
+          <w:sz w:val="22"/>
+        </w:rPr>
+        <w:t>Impacto: 7 · On Track: Yes</w:t>
       </w:r>
     </w:p>
     <w:p>
@@ -2072,7 +1166,7 @@
           <w:i w:val="0"/>
           <w:sz w:val="22"/>
         </w:rPr>
-        <w:t>Durante o FY26, compartilhei conhecimentos e boas práticas em Inteligência Artificial e Microsoft Copilot com o time, contribuindo para um ambiente colaborativo, inovador e orientado a aprendizado contínuo.</w:t>
+        <w:t>Durante o FY26, contribuí para a disseminação de conhecimento em tecnologia e Inteligência Artificial e para o fortalecimento da comunidade de reinventores, promovendo uso responsável de IA e desenvolvimento de habilidades digitais.</w:t>
       </w:r>
     </w:p>
     <w:p>
@@ -2083,7 +1177,25 @@
           <w:i w:val="0"/>
           <w:sz w:val="22"/>
         </w:rPr>
-        <w:t>O que deu certo: atuei de forma consistente como referência prática no uso de IA no desenvolvimento mobile, apoiando colegas na adoção de ferramentas e na melhoria da forma de trabalhar. Os feedbacks do período reforçam exatamente esse papel: Sergio Deiró destacou disponibilidade para apoiar colegas, participação em discussões técnicas, contribuição em melhorias de arquitetura/processos e recomendou manter o foco em disseminar conhecimento para fortalecer a referência técnica; Anderson ressaltou colaboração entre papéis e ajuda na resolução de problemas; João Victor destacou postura prestativa e facilitação entre Dev e QA. Além disso, como People Lead, ampliei a disseminação para além do squad — apoiando profissionais em carreira, ciclo de avaliação e uso consciente de práticas de desenvolvimento/IA.</w:t>
+        <w:t xml:space="preserve">O que deu certo: compartilhei práticas de uso de IA (incluindo o </w:t>
+      </w:r>
+      <w:r>
+        <w:rPr>
+          <w:rFonts w:ascii="Calibri" w:hAnsi="Calibri" w:eastAsia="Calibri"/>
+          <w:b/>
+          <w:i w:val="0"/>
+          <w:sz w:val="22"/>
+        </w:rPr>
+        <w:t>Cursor</w:t>
+      </w:r>
+      <w:r>
+        <w:rPr>
+          <w:rFonts w:ascii="Calibri" w:hAnsi="Calibri" w:eastAsia="Calibri"/>
+          <w:b w:val="0"/>
+          <w:i w:val="0"/>
+          <w:sz w:val="22"/>
+        </w:rPr>
+        <w:t xml:space="preserve"> no contexto de desenvolvimento) e assumi atuação como People Lead, mentorando profissionais em carreira, ciclo de performance e orientação para autoavaliação no Workday. Essa atuação fortalece a comunidade interna e o desenvolvimento de pessoas. Também mantive postura colaborativa reconhecida por pares e parceiros (apoio a colegas e facilitação Dev–QA).</w:t>
       </w:r>
     </w:p>
     <w:p>
@@ -2094,7 +1206,7 @@
           <w:i w:val="0"/>
           <w:sz w:val="22"/>
         </w:rPr>
-        <w:t>O que poderia ser melhor: formalizar mais sessões técnicas / demos curtas de Copilot para o time e registrar materiais reutilizáveis (prompts, checklist, exemplos), para escalar o impacto da disseminação.</w:t>
+        <w:t>O que poderia ser melhor: ampliar participação em ações formais de voluntariado educacional externo e registrar horas/iniciativas de forma mais estruturada.</w:t>
       </w:r>
     </w:p>
     <w:p>
@@ -2105,7 +1217,7 @@
           <w:i w:val="0"/>
           <w:sz w:val="22"/>
         </w:rPr>
-        <w:t>Próximos passos: manter mentoria informal e apoio ao time; organizar compartilhamentos objetivos de IA aplicada ao mobile; continuar evoluindo para discussões técnicas mais estratégicas e de arquitetura, como sugerido pelo Tech Lead.</w:t>
+        <w:t>Próximos passos: manter a mentoria como People Lead; apoiar iniciativas de educação tecnológica/IA sempre que possível; continuar promovendo uso ético e responsável de IA (incluindo boas práticas com ferramentas como Cursor).</w:t>
       </w:r>
     </w:p>
     <w:p>
@@ -2113,45 +1225,7 @@
         <w:pStyle w:val="Heading3"/>
       </w:pPr>
       <w:r>
-        <w:t>Self Reflection — Level of Impact</w:t>
-      </w:r>
-    </w:p>
-    <w:p>
-      <w:r>
-        <w:rPr>
-          <w:rFonts w:ascii="Calibri" w:hAnsi="Calibri" w:eastAsia="Calibri"/>
-          <w:b/>
-          <w:i w:val="0"/>
-          <w:sz w:val="22"/>
-        </w:rPr>
-        <w:t>8–9 (High)</w:t>
-      </w:r>
-    </w:p>
-    <w:p>
-      <w:pPr>
-        <w:pStyle w:val="Heading3"/>
-      </w:pPr>
-      <w:r>
-        <w:t>Self On Track</w:t>
-      </w:r>
-    </w:p>
-    <w:p>
-      <w:r>
-        <w:rPr>
-          <w:rFonts w:ascii="Calibri" w:hAnsi="Calibri" w:eastAsia="Calibri"/>
-          <w:b/>
-          <w:i w:val="0"/>
-          <w:sz w:val="22"/>
-        </w:rPr>
-        <w:t>Yes</w:t>
-      </w:r>
-    </w:p>
-    <w:p>
-      <w:pPr>
-        <w:pStyle w:val="Heading3"/>
-      </w:pPr>
-      <w:r>
-        <w:t>Priority Success Actuals</w:t>
+        <w:t>Actuals</w:t>
       </w:r>
     </w:p>
     <w:tbl>
@@ -2211,7 +1285,327 @@
                 <w:color w:val="FFFFFF"/>
                 <w:sz w:val="20"/>
               </w:rPr>
-              <w:t>Actual sugerido</w:t>
+              <w:t>Actual</w:t>
+            </w:r>
+          </w:p>
+        </w:tc>
+      </w:tr>
+      <w:tr>
+        <w:tc>
+          <w:tcPr>
+            <w:tcW w:type="dxa" w:w="4873"/>
+          </w:tcPr>
+          <w:p>
+            <w:r>
+              <w:rPr>
+                <w:sz w:val="20"/>
+              </w:rPr>
+            </w:r>
+            <w:r>
+              <w:rPr>
+                <w:rFonts w:ascii="Calibri" w:hAnsi="Calibri" w:eastAsia="Calibri"/>
+                <w:b w:val="0"/>
+                <w:i w:val="0"/>
+                <w:sz w:val="20"/>
+              </w:rPr>
+              <w:t>Other (Non-Financial)</w:t>
+            </w:r>
+          </w:p>
+        </w:tc>
+        <w:tc>
+          <w:tcPr>
+            <w:tcW w:type="dxa" w:w="4873"/>
+          </w:tcPr>
+          <w:p>
+            <w:r>
+              <w:rPr>
+                <w:sz w:val="20"/>
+              </w:rPr>
+            </w:r>
+            <w:r>
+              <w:rPr>
+                <w:rFonts w:ascii="Calibri" w:hAnsi="Calibri" w:eastAsia="Calibri"/>
+                <w:b w:val="0"/>
+                <w:i w:val="0"/>
+                <w:sz w:val="20"/>
+              </w:rPr>
+              <w:t>Promoção do uso responsável de IA (Cursor) com qualidade, colaboração e boas práticas</w:t>
+            </w:r>
+          </w:p>
+        </w:tc>
+      </w:tr>
+      <w:tr>
+        <w:tc>
+          <w:tcPr>
+            <w:tcW w:type="dxa" w:w="4873"/>
+            <w:shd w:fill="F3F6FA" w:val="clear"/>
+          </w:tcPr>
+          <w:p>
+            <w:r>
+              <w:rPr>
+                <w:sz w:val="20"/>
+              </w:rPr>
+            </w:r>
+            <w:r>
+              <w:rPr>
+                <w:rFonts w:ascii="Calibri" w:hAnsi="Calibri" w:eastAsia="Calibri"/>
+                <w:b w:val="0"/>
+                <w:i w:val="0"/>
+                <w:sz w:val="20"/>
+              </w:rPr>
+              <w:t>Community Volunteering</w:t>
+            </w:r>
+          </w:p>
+        </w:tc>
+        <w:tc>
+          <w:tcPr>
+            <w:tcW w:type="dxa" w:w="4873"/>
+            <w:shd w:fill="F3F6FA" w:val="clear"/>
+          </w:tcPr>
+          <w:p>
+            <w:r>
+              <w:rPr>
+                <w:sz w:val="20"/>
+              </w:rPr>
+            </w:r>
+            <w:r>
+              <w:rPr>
+                <w:rFonts w:ascii="Calibri" w:hAnsi="Calibri" w:eastAsia="Calibri"/>
+                <w:b w:val="0"/>
+                <w:i w:val="0"/>
+                <w:sz w:val="20"/>
+              </w:rPr>
+              <w:t>Atuação como People Lead (mentoria e orientação de carreira/ciclo); [somar voluntariado externo se houver]</w:t>
+            </w:r>
+          </w:p>
+        </w:tc>
+      </w:tr>
+      <w:tr>
+        <w:tc>
+          <w:tcPr>
+            <w:tcW w:type="dxa" w:w="4873"/>
+          </w:tcPr>
+          <w:p>
+            <w:r>
+              <w:rPr>
+                <w:sz w:val="20"/>
+              </w:rPr>
+            </w:r>
+            <w:r>
+              <w:rPr>
+                <w:rFonts w:ascii="Calibri" w:hAnsi="Calibri" w:eastAsia="Calibri"/>
+                <w:b w:val="0"/>
+                <w:i w:val="0"/>
+                <w:sz w:val="20"/>
+              </w:rPr>
+              <w:t>Social &amp; Environmental Citizenship</w:t>
+            </w:r>
+          </w:p>
+        </w:tc>
+        <w:tc>
+          <w:tcPr>
+            <w:tcW w:type="dxa" w:w="4873"/>
+          </w:tcPr>
+          <w:p>
+            <w:r>
+              <w:rPr>
+                <w:sz w:val="20"/>
+              </w:rPr>
+            </w:r>
+            <w:r>
+              <w:rPr>
+                <w:rFonts w:ascii="Calibri" w:hAnsi="Calibri" w:eastAsia="Calibri"/>
+                <w:b w:val="0"/>
+                <w:i w:val="0"/>
+                <w:sz w:val="20"/>
+              </w:rPr>
+              <w:t>Disseminação de conhecimento em tecnologia/IA por mentoria, apoio a colegas e orientação de profissionais</w:t>
+            </w:r>
+          </w:p>
+        </w:tc>
+      </w:tr>
+    </w:tbl>
+    <w:p/>
+    <w:p>
+      <w:pPr>
+        <w:pBdr>
+          <w:bottom w:val="single" w:sz="6" w:space="1" w:color="CCCCCC"/>
+        </w:pBdr>
+      </w:pPr>
+    </w:p>
+    <w:p>
+      <w:pPr>
+        <w:pStyle w:val="Heading1"/>
+      </w:pPr>
+      <w:r>
+        <w:t>4) Disseminação de conhecimento em IA e inovação</w:t>
+      </w:r>
+    </w:p>
+    <w:p>
+      <w:r>
+        <w:rPr>
+          <w:rFonts w:ascii="Calibri" w:hAnsi="Calibri" w:eastAsia="Calibri"/>
+          <w:b/>
+          <w:i w:val="0"/>
+          <w:sz w:val="22"/>
+        </w:rPr>
+        <w:t>Categoria:</w:t>
+      </w:r>
+      <w:r>
+        <w:rPr>
+          <w:rFonts w:ascii="Calibri" w:hAnsi="Calibri" w:eastAsia="Calibri"/>
+          <w:b w:val="0"/>
+          <w:i w:val="0"/>
+          <w:sz w:val="22"/>
+        </w:rPr>
+        <w:t xml:space="preserve"> Great Place to Work · </w:t>
+      </w:r>
+      <w:r>
+        <w:rPr>
+          <w:rFonts w:ascii="Calibri" w:hAnsi="Calibri" w:eastAsia="Calibri"/>
+          <w:b/>
+          <w:i w:val="0"/>
+          <w:sz w:val="22"/>
+        </w:rPr>
+        <w:t>Impacto: 8–9 · On Track: Yes</w:t>
+      </w:r>
+    </w:p>
+    <w:p>
+      <w:pPr>
+        <w:pStyle w:val="Heading3"/>
+      </w:pPr>
+      <w:r>
+        <w:t>Self Reflection Comments (colar)</w:t>
+      </w:r>
+    </w:p>
+    <w:p>
+      <w:r>
+        <w:rPr>
+          <w:rFonts w:ascii="Calibri" w:hAnsi="Calibri" w:eastAsia="Calibri"/>
+          <w:b w:val="0"/>
+          <w:i w:val="0"/>
+          <w:sz w:val="22"/>
+        </w:rPr>
+        <w:t xml:space="preserve">Durante o FY26, compartilhei conhecimentos e boas práticas em Inteligência Artificial e uso de ferramentas de IA no desenvolvimento — em especial o </w:t>
+      </w:r>
+      <w:r>
+        <w:rPr>
+          <w:rFonts w:ascii="Calibri" w:hAnsi="Calibri" w:eastAsia="Calibri"/>
+          <w:b/>
+          <w:i w:val="0"/>
+          <w:sz w:val="22"/>
+        </w:rPr>
+        <w:t>Cursor</w:t>
+      </w:r>
+      <w:r>
+        <w:rPr>
+          <w:rFonts w:ascii="Calibri" w:hAnsi="Calibri" w:eastAsia="Calibri"/>
+          <w:b w:val="0"/>
+          <w:i w:val="0"/>
+          <w:sz w:val="22"/>
+        </w:rPr>
+        <w:t xml:space="preserve"> no cliente RD — promovendo um ambiente colaborativo, inovador e orientado a aprendizado contínuo.</w:t>
+      </w:r>
+    </w:p>
+    <w:p>
+      <w:r>
+        <w:rPr>
+          <w:rFonts w:ascii="Calibri" w:hAnsi="Calibri" w:eastAsia="Calibri"/>
+          <w:b w:val="0"/>
+          <w:i w:val="0"/>
+          <w:sz w:val="22"/>
+        </w:rPr>
+        <w:t>O que deu certo: atuei como referência prática no uso de IA/Cursor no desenvolvimento mobile, apoiando colegas na adoção de novas formas de trabalhar. Os feedbacks reforçam esse papel: Sergio Deiró destacou disponibilidade para apoiar colegas, discussões técnicas e recomendou manter o foco em disseminar conhecimento para fortalecer a referência técnica; Anderson ressaltou colaboração; João Victor destacou postura prestativa e facilitação Dev–QA. Como People Lead, ampliei a disseminação para além do squad — apoiando profissionais em carreira e no ciclo de avaliação.</w:t>
+      </w:r>
+    </w:p>
+    <w:p>
+      <w:r>
+        <w:rPr>
+          <w:rFonts w:ascii="Calibri" w:hAnsi="Calibri" w:eastAsia="Calibri"/>
+          <w:b w:val="0"/>
+          <w:i w:val="0"/>
+          <w:sz w:val="22"/>
+        </w:rPr>
+        <w:t>O que poderia ser melhor: formalizar mais sessões técnicas/demos curtas de uso do Cursor e registrar materiais reutilizáveis (prompts, checklist, exemplos) para escalar o impacto.</w:t>
+      </w:r>
+    </w:p>
+    <w:p>
+      <w:r>
+        <w:rPr>
+          <w:rFonts w:ascii="Calibri" w:hAnsi="Calibri" w:eastAsia="Calibri"/>
+          <w:b w:val="0"/>
+          <w:i w:val="0"/>
+          <w:sz w:val="22"/>
+        </w:rPr>
+        <w:t>Próximos passos: manter mentoria e apoio ao time; organizar compartilhamentos objetivos de IA aplicada ao mobile com Cursor; evoluir para discussões técnicas mais estratégicas e de arquitetura, como sugerido pelo Tech Lead.</w:t>
+      </w:r>
+    </w:p>
+    <w:p>
+      <w:pPr>
+        <w:pStyle w:val="Heading3"/>
+      </w:pPr>
+      <w:r>
+        <w:t>Actuals</w:t>
+      </w:r>
+    </w:p>
+    <w:tbl>
+      <w:tblPr>
+        <w:tblStyle w:val="TableGrid"/>
+        <w:tblW w:type="auto" w:w="0"/>
+        <w:tblLook w:firstColumn="1" w:firstRow="1" w:lastColumn="0" w:lastRow="0" w:noHBand="0" w:noVBand="1" w:val="04A0"/>
+      </w:tblPr>
+      <w:tblGrid>
+        <w:gridCol w:w="4873"/>
+        <w:gridCol w:w="4873"/>
+      </w:tblGrid>
+      <w:tr>
+        <w:tc>
+          <w:tcPr>
+            <w:tcW w:type="dxa" w:w="4873"/>
+            <w:shd w:fill="1F3A5F" w:val="clear"/>
+          </w:tcPr>
+          <w:p>
+            <w:r>
+              <w:rPr>
+                <w:b/>
+                <w:color w:val="FFFFFF"/>
+                <w:sz w:val="20"/>
+              </w:rPr>
+            </w:r>
+            <w:r>
+              <w:rPr>
+                <w:rFonts w:ascii="Calibri" w:hAnsi="Calibri" w:eastAsia="Calibri"/>
+                <w:b/>
+                <w:i w:val="0"/>
+                <w:color w:val="FFFFFF"/>
+                <w:sz w:val="20"/>
+              </w:rPr>
+              <w:t>Métrica</w:t>
+            </w:r>
+          </w:p>
+        </w:tc>
+        <w:tc>
+          <w:tcPr>
+            <w:tcW w:type="dxa" w:w="4873"/>
+            <w:shd w:fill="1F3A5F" w:val="clear"/>
+          </w:tcPr>
+          <w:p>
+            <w:r>
+              <w:rPr>
+                <w:b/>
+                <w:color w:val="FFFFFF"/>
+                <w:sz w:val="20"/>
+              </w:rPr>
+            </w:r>
+            <w:r>
+              <w:rPr>
+                <w:rFonts w:ascii="Calibri" w:hAnsi="Calibri" w:eastAsia="Calibri"/>
+                <w:b/>
+                <w:i w:val="0"/>
+                <w:color w:val="FFFFFF"/>
+                <w:sz w:val="20"/>
+              </w:rPr>
+              <w:t>Actual</w:t>
             </w:r>
           </w:p>
         </w:tc>
@@ -2255,7 +1649,7 @@
                 <w:i w:val="0"/>
                 <w:sz w:val="20"/>
               </w:rPr>
-              <w:t>Compartilhamento contínuo de práticas de IA/Copilot com colegas; atuação como People Lead com mentoria de carreira e suporte ao ciclo de performance</w:t>
+              <w:t>Compartilhamento de práticas de IA/Cursor com colegas; atuação como People Lead</w:t>
             </w:r>
           </w:p>
         </w:tc>
@@ -2301,7 +1695,7 @@
                 <w:i w:val="0"/>
                 <w:sz w:val="20"/>
               </w:rPr>
-              <w:t>Incentivo à adoção de IA no time mobile e melhoria da forma de trabalhar (qualidade, eficiência, colaboração)</w:t>
+              <w:t>Incentivo à adoção de IA (Cursor) no time mobile e melhoria da forma de trabalhar</w:t>
             </w:r>
           </w:p>
         </w:tc>
@@ -2345,7 +1739,7 @@
                 <w:i w:val="0"/>
                 <w:sz w:val="20"/>
               </w:rPr>
-              <w:t>Atuação como referência prática de IA no desenvolvimento mobile; apoio a colegas e fortalecimento da cultura de aprendizado contínuo</w:t>
+              <w:t>Referência prática de IA/Cursor no desenvolvimento mobile; apoio a colegas e cultura de aprendizado contínuo</w:t>
             </w:r>
           </w:p>
         </w:tc>
@@ -2364,371 +1758,7 @@
         <w:pStyle w:val="Heading2"/>
       </w:pPr>
       <w:r>
-        <w:t>Resumo rápido — o que marcar</w:t>
-      </w:r>
-    </w:p>
-    <w:tbl>
-      <w:tblPr>
-        <w:tblStyle w:val="TableGrid"/>
-        <w:tblW w:type="auto" w:w="0"/>
-        <w:tblLook w:firstColumn="1" w:firstRow="1" w:lastColumn="0" w:lastRow="0" w:noHBand="0" w:noVBand="1" w:val="04A0"/>
-      </w:tblPr>
-      <w:tblGrid>
-        <w:gridCol w:w="3249"/>
-        <w:gridCol w:w="3249"/>
-        <w:gridCol w:w="3249"/>
-      </w:tblGrid>
-      <w:tr>
-        <w:tc>
-          <w:tcPr>
-            <w:tcW w:type="dxa" w:w="3249"/>
-            <w:shd w:fill="1F3A5F" w:val="clear"/>
-          </w:tcPr>
-          <w:p>
-            <w:r>
-              <w:rPr>
-                <w:b/>
-                <w:color w:val="FFFFFF"/>
-                <w:sz w:val="20"/>
-              </w:rPr>
-            </w:r>
-            <w:r>
-              <w:rPr>
-                <w:rFonts w:ascii="Calibri" w:hAnsi="Calibri" w:eastAsia="Calibri"/>
-                <w:b/>
-                <w:i w:val="0"/>
-                <w:color w:val="FFFFFF"/>
-                <w:sz w:val="20"/>
-              </w:rPr>
-              <w:t>Prioridade</w:t>
-            </w:r>
-          </w:p>
-        </w:tc>
-        <w:tc>
-          <w:tcPr>
-            <w:tcW w:type="dxa" w:w="3249"/>
-            <w:shd w:fill="1F3A5F" w:val="clear"/>
-          </w:tcPr>
-          <w:p>
-            <w:r>
-              <w:rPr>
-                <w:b/>
-                <w:color w:val="FFFFFF"/>
-                <w:sz w:val="20"/>
-              </w:rPr>
-            </w:r>
-            <w:r>
-              <w:rPr>
-                <w:rFonts w:ascii="Calibri" w:hAnsi="Calibri" w:eastAsia="Calibri"/>
-                <w:b/>
-                <w:i w:val="0"/>
-                <w:color w:val="FFFFFF"/>
-                <w:sz w:val="20"/>
-              </w:rPr>
-              <w:t>Impacto</w:t>
-            </w:r>
-          </w:p>
-        </w:tc>
-        <w:tc>
-          <w:tcPr>
-            <w:tcW w:type="dxa" w:w="3249"/>
-            <w:shd w:fill="1F3A5F" w:val="clear"/>
-          </w:tcPr>
-          <w:p>
-            <w:r>
-              <w:rPr>
-                <w:b/>
-                <w:color w:val="FFFFFF"/>
-                <w:sz w:val="20"/>
-              </w:rPr>
-            </w:r>
-            <w:r>
-              <w:rPr>
-                <w:rFonts w:ascii="Calibri" w:hAnsi="Calibri" w:eastAsia="Calibri"/>
-                <w:b/>
-                <w:i w:val="0"/>
-                <w:color w:val="FFFFFF"/>
-                <w:sz w:val="20"/>
-              </w:rPr>
-              <w:t>On Track</w:t>
-            </w:r>
-          </w:p>
-        </w:tc>
-      </w:tr>
-      <w:tr>
-        <w:tc>
-          <w:tcPr>
-            <w:tcW w:type="dxa" w:w="3249"/>
-          </w:tcPr>
-          <w:p>
-            <w:r>
-              <w:rPr>
-                <w:sz w:val="20"/>
-              </w:rPr>
-            </w:r>
-            <w:r>
-              <w:rPr>
-                <w:rFonts w:ascii="Calibri" w:hAnsi="Calibri" w:eastAsia="Calibri"/>
-                <w:b w:val="0"/>
-                <w:i w:val="0"/>
-                <w:sz w:val="20"/>
-              </w:rPr>
-              <w:t>1. Aplicação de IA (Client Value)</w:t>
-            </w:r>
-          </w:p>
-        </w:tc>
-        <w:tc>
-          <w:tcPr>
-            <w:tcW w:type="dxa" w:w="3249"/>
-          </w:tcPr>
-          <w:p>
-            <w:r>
-              <w:rPr>
-                <w:sz w:val="20"/>
-              </w:rPr>
-            </w:r>
-            <w:r>
-              <w:rPr>
-                <w:rFonts w:ascii="Calibri" w:hAnsi="Calibri" w:eastAsia="Calibri"/>
-                <w:b w:val="0"/>
-                <w:i w:val="0"/>
-                <w:sz w:val="20"/>
-              </w:rPr>
-              <w:t>8–9</w:t>
-            </w:r>
-          </w:p>
-        </w:tc>
-        <w:tc>
-          <w:tcPr>
-            <w:tcW w:type="dxa" w:w="3249"/>
-          </w:tcPr>
-          <w:p>
-            <w:r>
-              <w:rPr>
-                <w:sz w:val="20"/>
-              </w:rPr>
-            </w:r>
-            <w:r>
-              <w:rPr>
-                <w:rFonts w:ascii="Calibri" w:hAnsi="Calibri" w:eastAsia="Calibri"/>
-                <w:b w:val="0"/>
-                <w:i w:val="0"/>
-                <w:sz w:val="20"/>
-              </w:rPr>
-              <w:t>Yes</w:t>
-            </w:r>
-          </w:p>
-        </w:tc>
-      </w:tr>
-      <w:tr>
-        <w:tc>
-          <w:tcPr>
-            <w:tcW w:type="dxa" w:w="3249"/>
-            <w:shd w:fill="F3F6FA" w:val="clear"/>
-          </w:tcPr>
-          <w:p>
-            <w:r>
-              <w:rPr>
-                <w:sz w:val="20"/>
-              </w:rPr>
-            </w:r>
-            <w:r>
-              <w:rPr>
-                <w:rFonts w:ascii="Calibri" w:hAnsi="Calibri" w:eastAsia="Calibri"/>
-                <w:b w:val="0"/>
-                <w:i w:val="0"/>
-                <w:sz w:val="20"/>
-              </w:rPr>
-              <w:t>2. Capacitação IA</w:t>
-            </w:r>
-          </w:p>
-        </w:tc>
-        <w:tc>
-          <w:tcPr>
-            <w:tcW w:type="dxa" w:w="3249"/>
-            <w:shd w:fill="F3F6FA" w:val="clear"/>
-          </w:tcPr>
-          <w:p>
-            <w:r>
-              <w:rPr>
-                <w:sz w:val="20"/>
-              </w:rPr>
-            </w:r>
-            <w:r>
-              <w:rPr>
-                <w:rFonts w:ascii="Calibri" w:hAnsi="Calibri" w:eastAsia="Calibri"/>
-                <w:b w:val="0"/>
-                <w:i w:val="0"/>
-                <w:sz w:val="20"/>
-              </w:rPr>
-              <w:t>8 (com badge) / 6–7 (sem)</w:t>
-            </w:r>
-          </w:p>
-        </w:tc>
-        <w:tc>
-          <w:tcPr>
-            <w:tcW w:type="dxa" w:w="3249"/>
-            <w:shd w:fill="F3F6FA" w:val="clear"/>
-          </w:tcPr>
-          <w:p>
-            <w:r>
-              <w:rPr>
-                <w:sz w:val="20"/>
-              </w:rPr>
-            </w:r>
-            <w:r>
-              <w:rPr>
-                <w:rFonts w:ascii="Calibri" w:hAnsi="Calibri" w:eastAsia="Calibri"/>
-                <w:b w:val="0"/>
-                <w:i w:val="0"/>
-                <w:sz w:val="20"/>
-              </w:rPr>
-              <w:t>Yes / parcial</w:t>
-            </w:r>
-          </w:p>
-        </w:tc>
-      </w:tr>
-      <w:tr>
-        <w:tc>
-          <w:tcPr>
-            <w:tcW w:type="dxa" w:w="3249"/>
-          </w:tcPr>
-          <w:p>
-            <w:r>
-              <w:rPr>
-                <w:sz w:val="20"/>
-              </w:rPr>
-            </w:r>
-            <w:r>
-              <w:rPr>
-                <w:rFonts w:ascii="Calibri" w:hAnsi="Calibri" w:eastAsia="Calibri"/>
-                <w:b w:val="0"/>
-                <w:i w:val="0"/>
-                <w:sz w:val="20"/>
-              </w:rPr>
-              <w:t>3. Comunidade</w:t>
-            </w:r>
-          </w:p>
-        </w:tc>
-        <w:tc>
-          <w:tcPr>
-            <w:tcW w:type="dxa" w:w="3249"/>
-          </w:tcPr>
-          <w:p>
-            <w:r>
-              <w:rPr>
-                <w:sz w:val="20"/>
-              </w:rPr>
-            </w:r>
-            <w:r>
-              <w:rPr>
-                <w:rFonts w:ascii="Calibri" w:hAnsi="Calibri" w:eastAsia="Calibri"/>
-                <w:b w:val="0"/>
-                <w:i w:val="0"/>
-                <w:sz w:val="20"/>
-              </w:rPr>
-              <w:t>7–8</w:t>
-            </w:r>
-          </w:p>
-        </w:tc>
-        <w:tc>
-          <w:tcPr>
-            <w:tcW w:type="dxa" w:w="3249"/>
-          </w:tcPr>
-          <w:p>
-            <w:r>
-              <w:rPr>
-                <w:sz w:val="20"/>
-              </w:rPr>
-            </w:r>
-            <w:r>
-              <w:rPr>
-                <w:rFonts w:ascii="Calibri" w:hAnsi="Calibri" w:eastAsia="Calibri"/>
-                <w:b w:val="0"/>
-                <w:i w:val="0"/>
-                <w:sz w:val="20"/>
-              </w:rPr>
-              <w:t>Yes</w:t>
-            </w:r>
-          </w:p>
-        </w:tc>
-      </w:tr>
-      <w:tr>
-        <w:tc>
-          <w:tcPr>
-            <w:tcW w:type="dxa" w:w="3249"/>
-            <w:shd w:fill="F3F6FA" w:val="clear"/>
-          </w:tcPr>
-          <w:p>
-            <w:r>
-              <w:rPr>
-                <w:sz w:val="20"/>
-              </w:rPr>
-            </w:r>
-            <w:r>
-              <w:rPr>
-                <w:rFonts w:ascii="Calibri" w:hAnsi="Calibri" w:eastAsia="Calibri"/>
-                <w:b w:val="0"/>
-                <w:i w:val="0"/>
-                <w:sz w:val="20"/>
-              </w:rPr>
-              <w:t>4. Disseminação IA</w:t>
-            </w:r>
-          </w:p>
-        </w:tc>
-        <w:tc>
-          <w:tcPr>
-            <w:tcW w:type="dxa" w:w="3249"/>
-            <w:shd w:fill="F3F6FA" w:val="clear"/>
-          </w:tcPr>
-          <w:p>
-            <w:r>
-              <w:rPr>
-                <w:sz w:val="20"/>
-              </w:rPr>
-            </w:r>
-            <w:r>
-              <w:rPr>
-                <w:rFonts w:ascii="Calibri" w:hAnsi="Calibri" w:eastAsia="Calibri"/>
-                <w:b w:val="0"/>
-                <w:i w:val="0"/>
-                <w:sz w:val="20"/>
-              </w:rPr>
-              <w:t>8–9</w:t>
-            </w:r>
-          </w:p>
-        </w:tc>
-        <w:tc>
-          <w:tcPr>
-            <w:tcW w:type="dxa" w:w="3249"/>
-            <w:shd w:fill="F3F6FA" w:val="clear"/>
-          </w:tcPr>
-          <w:p>
-            <w:r>
-              <w:rPr>
-                <w:sz w:val="20"/>
-              </w:rPr>
-            </w:r>
-            <w:r>
-              <w:rPr>
-                <w:rFonts w:ascii="Calibri" w:hAnsi="Calibri" w:eastAsia="Calibri"/>
-                <w:b w:val="0"/>
-                <w:i w:val="0"/>
-                <w:sz w:val="20"/>
-              </w:rPr>
-              <w:t>Yes</w:t>
-            </w:r>
-          </w:p>
-        </w:tc>
-      </w:tr>
-    </w:tbl>
-    <w:p/>
-    <w:p>
-      <w:pPr>
-        <w:pStyle w:val="Heading2"/>
-      </w:pPr>
-      <w:r>
-        <w:t>Checklist antes de enviar</w:t>
+        <w:t>Checklist</w:t>
       </w:r>
     </w:p>
     <w:p>
@@ -2742,7 +1772,7 @@
           <w:i w:val="0"/>
           <w:sz w:val="22"/>
         </w:rPr>
-        <w:t xml:space="preserve">☐ Reflexão 1 enviada  </w:t>
+        <w:t>☐ Reflexão 1 enviada (Cursor no RD em evidência)</w:t>
       </w:r>
     </w:p>
     <w:p>
@@ -2756,7 +1786,7 @@
           <w:i w:val="0"/>
           <w:sz w:val="22"/>
         </w:rPr>
-        <w:t xml:space="preserve">☐ Reflexão 2 enviada (certificação: fato real)  </w:t>
+        <w:t>☐ Reflexão 2 enviada (certificação: fato real)</w:t>
       </w:r>
     </w:p>
     <w:p>
@@ -2770,7 +1800,7 @@
           <w:i w:val="0"/>
           <w:sz w:val="22"/>
         </w:rPr>
-        <w:t xml:space="preserve">☐ Reflexão 3 enviada  </w:t>
+        <w:t>☐ Reflexão 3 enviada</w:t>
       </w:r>
     </w:p>
     <w:p>
@@ -2784,7 +1814,7 @@
           <w:i w:val="0"/>
           <w:sz w:val="22"/>
         </w:rPr>
-        <w:t xml:space="preserve">☐ Reflexão 4 enviada  </w:t>
+        <w:t>☐ Reflexão 4 enviada</w:t>
       </w:r>
     </w:p>
     <w:p>
@@ -2798,7 +1828,7 @@
           <w:i w:val="0"/>
           <w:sz w:val="22"/>
         </w:rPr>
-        <w:t xml:space="preserve">☐ Actuals preenchidos nas 3 métricas de cada uma  </w:t>
+        <w:t>☐ Actuals preenchidos</w:t>
       </w:r>
     </w:p>
     <w:p>
@@ -2812,7 +1842,7 @@
           <w:i w:val="0"/>
           <w:sz w:val="22"/>
         </w:rPr>
-        <w:t>☐ Solicitar/acompanhar PR reflections (</w:t>
+        <w:t xml:space="preserve">☐ PRs: </w:t>
       </w:r>
       <w:r>
         <w:rPr>
@@ -2831,7 +1861,7 @@
           <w:i w:val="0"/>
           <w:sz w:val="22"/>
         </w:rPr>
-        <w:t xml:space="preserve">, </w:t>
+        <w:t xml:space="preserve"> / </w:t>
       </w:r>
       <w:r>
         <w:rPr>
@@ -2842,45 +1872,6 @@
           <w:sz w:val="18"/>
         </w:rPr>
         <w:t>e.melo.pereira.souza</w:t>
-      </w:r>
-      <w:r>
-        <w:rPr>
-          <w:rFonts w:ascii="Calibri" w:hAnsi="Calibri" w:eastAsia="Calibri"/>
-          <w:b w:val="0"/>
-          <w:i w:val="0"/>
-          <w:sz w:val="22"/>
-        </w:rPr>
-        <w:t xml:space="preserve">)  </w:t>
-      </w:r>
-    </w:p>
-    <w:p>
-      <w:pPr>
-        <w:pStyle w:val="Heading2"/>
-      </w:pPr>
-      <w:r>
-        <w:t>Frase útil se o PR pedir contexto</w:t>
-      </w:r>
-    </w:p>
-    <w:p>
-      <w:r>
-        <w:rPr>
-          <w:rFonts w:ascii="Calibri" w:hAnsi="Calibri" w:eastAsia="Calibri"/>
-          <w:b w:val="0"/>
-          <w:i w:val="0"/>
-          <w:sz w:val="22"/>
-        </w:rPr>
-        <w:t>Você pode encaminhar aos revisores:</w:t>
-      </w:r>
-    </w:p>
-    <w:p>
-      <w:r>
-        <w:rPr>
-          <w:rFonts w:ascii="Calibri" w:hAnsi="Calibri" w:eastAsia="Calibri"/>
-          <w:b w:val="0"/>
-          <w:i w:val="0"/>
-          <w:sz w:val="22"/>
-        </w:rPr>
-        <w:t>“Prioridades e autorreflexões atualizadas no Workday para o Year-End. Peço, por favor, a reflexão de revisor quando o fluxo liberar. Obrigado!”</w:t>
       </w:r>
     </w:p>
     <w:sectPr>

</xml_diff>